<commit_message>
Finalize publication links, references, and catalogue
</commit_message>
<xml_diff>
--- a/docs/instruments/a3_supervisor_survey.docx
+++ b/docs/instruments/a3_supervisor_survey.docx
@@ -1,49 +1,49 @@
 
 <file path=word/document.xml><?xml version="1.0" encoding="utf-8"?>
-<w:document xmlns:o="urn:schemas-microsoft-com:office:office" xmlns:r="http://schemas.openxmlformats.org/officeDocument/2006/relationships" xmlns:v="urn:schemas-microsoft-com:vml" xmlns:w="http://schemas.openxmlformats.org/wordprocessingml/2006/main" xmlns:w10="urn:schemas-microsoft-com:office:word" xmlns:wp="http://schemas.openxmlformats.org/drawingml/2006/wordprocessingDrawing" xmlns:pic="http://schemas.openxmlformats.org/drawingml/2006/picture" xmlns:wps="http://schemas.microsoft.com/office/word/2010/wordprocessingShape" xmlns:wpg="http://schemas.microsoft.com/office/word/2010/wordprocessingGroup" xmlns:mc="http://schemas.openxmlformats.org/markup-compatibility/2006" xmlns:wp14="http://schemas.microsoft.com/office/word/2010/wordprocessingDrawing" xmlns:w14="http://schemas.microsoft.com/office/word/2010/wordml" xmlns:w15="http://schemas.microsoft.com/office/word/2012/wordml" mc:Ignorable="w14 wp14 w15">
+<w:document xmlns:ns1="http://schemas.openxmlformats.org/markup-compatibility/2006" xmlns:ns10="urn:schemas-microsoft-com:office:word" xmlns:ns3="http://schemas.openxmlformats.org/drawingml/2006/wordprocessingDrawing" xmlns:ns4="http://schemas.openxmlformats.org/drawingml/2006/main" xmlns:ns5="http://schemas.openxmlformats.org/drawingml/2006/picture" xmlns:ns6="http://schemas.microsoft.com/office/word/2010/wordprocessingShape" xmlns:ns7="http://schemas.microsoft.com/office/word/2010/wordprocessingDrawing" xmlns:ns8="urn:schemas-microsoft-com:vml" xmlns:ns9="urn:schemas-microsoft-com:office:office" xmlns:r="http://schemas.openxmlformats.org/officeDocument/2006/relationships" xmlns:w="http://schemas.openxmlformats.org/wordprocessingml/2006/main" ns1:Ignorable="w14 wp14 w15">
   <w:body>
     <w:p>
       <w:hyperlink r:id="rId19">
         <w:r>
           <w:drawing>
-            <wp:inline>
-              <wp:extent cx="1325880" cy="341661"/>
-              <wp:effectExtent b="0" l="0" r="0" t="0"/>
-              <wp:docPr descr="Instats" title="" id="22" name="Picture"/>
-              <a:graphic xmlns:a="http://schemas.openxmlformats.org/drawingml/2006/main">
-                <a:graphicData uri="http://schemas.openxmlformats.org/drawingml/2006/picture">
-                  <pic:pic>
-                    <pic:nvPicPr>
-                      <pic:cNvPr descr="instats_logo.png" id="23" name="Picture"/>
-                      <pic:cNvPicPr>
-                        <a:picLocks noChangeArrowheads="1" noChangeAspect="1"/>
-                      </pic:cNvPicPr>
-                    </pic:nvPicPr>
-                    <pic:blipFill>
-                      <a:blip r:embed="rId18"/>
-                      <a:stretch>
-                        <a:fillRect/>
-                      </a:stretch>
-                    </pic:blipFill>
-                    <pic:spPr bwMode="auto">
-                      <a:xfrm>
-                        <a:off x="0" y="0"/>
-                        <a:ext cx="1325880" cy="341661"/>
-                      </a:xfrm>
-                      <a:prstGeom prst="rect">
-                        <a:avLst/>
-                      </a:prstGeom>
-                      <a:noFill/>
-                      <a:ln w="9525">
-                        <a:noFill/>
-                        <a:headEnd/>
-                        <a:tailEnd/>
-                      </a:ln>
-                    </pic:spPr>
-                  </pic:pic>
-                </a:graphicData>
-              </a:graphic>
-            </wp:inline>
+            <ns3:inline>
+              <ns3:extent cx="1325880" cy="341661"/>
+              <ns3:effectExtent b="0" l="0" r="0" t="0"/>
+              <ns3:docPr descr="Instats" title="" id="22" name="Picture"/>
+              <ns4:graphic>
+                <ns4:graphicData uri="http://schemas.openxmlformats.org/drawingml/2006/picture">
+                  <ns5:pic>
+                    <ns5:nvPicPr>
+                      <ns5:cNvPr descr="instats_logo.png" id="23" name="Picture"/>
+                      <ns5:cNvPicPr>
+                        <ns4:picLocks noChangeArrowheads="1" noChangeAspect="1"/>
+                      </ns5:cNvPicPr>
+                    </ns5:nvPicPr>
+                    <ns5:blipFill>
+                      <ns4:blip r:embed="rId18"/>
+                      <ns4:stretch>
+                        <ns4:fillRect/>
+                      </ns4:stretch>
+                    </ns5:blipFill>
+                    <ns5:spPr bwMode="auto">
+                      <ns4:xfrm>
+                        <ns4:off x="0" y="0"/>
+                        <ns4:ext cx="1325880" cy="341661"/>
+                      </ns4:xfrm>
+                      <ns4:prstGeom prst="rect">
+                        <ns4:avLst/>
+                      </ns4:prstGeom>
+                      <ns4:noFill/>
+                      <ns4:ln w="9525">
+                        <ns4:noFill/>
+                        <ns4:headEnd/>
+                        <ns4:tailEnd/>
+                      </ns4:ln>
+                    </ns5:spPr>
+                  </ns5:pic>
+                </ns4:graphicData>
+              </ns4:graphic>
+            </ns3:inline>
           </w:drawing>
         </w:r>
       </w:hyperlink>
@@ -79,60 +79,80 @@
       </w:pPr>
       <w:r>
         <w:rPr/>
-        <mc:AlternateContent>
-          <mc:Choice Requires="wps">
+        <ns1:AlternateContent>
+          <ns1:Choice Requires="wps">
             <w:drawing>
-              <wp:inline distT="0" distB="0" distL="0" distR="0">
-                <wp:extent cx="5760720" cy="19050"/>
-                <wp:effectExtent l="0" t="0" r="0" b="0"/>
-                <wp:docPr id="1" name="Shape1"/>
-                <a:graphic xmlns:a="http://schemas.openxmlformats.org/drawingml/2006/main">
-                  <a:graphicData uri="http://schemas.microsoft.com/office/word/2010/wordprocessingShape">
-                    <wps:wsp>
-                      <wps:cNvSpPr/>
-                      <wps:spPr>
-                        <a:xfrm>
-                          <a:off x="0" y="0"/>
-                          <a:ext cx="5760720" cy="19080"/>
-                        </a:xfrm>
-                        <a:prstGeom prst="rect">
-                          <a:avLst/>
-                        </a:prstGeom>
-                        <a:solidFill>
-                          <a:srgbClr val="FFFFFF"/>
-                        </a:solidFill>
-                        <a:ln w="0">
-                          <a:solidFill>
-                            <a:srgbClr val="000000"/>
-                          </a:solidFill>
-                        </a:ln>
-                      </wps:spPr>
-                      <wps:style>
-                        <a:lnRef idx="0"/>
-                        <a:fillRef idx="0"/>
-                        <a:effectRef idx="0"/>
-                        <a:fontRef idx="minor"/>
-                      </wps:style>
-                      <wps:bodyPr/>
-                    </wps:wsp>
-                  </a:graphicData>
-                </a:graphic>
-                <wp14:sizeRelH relativeFrom="page">
-                  <wp14:pctWidth>100000</wp14:pctWidth>
-                </wp14:sizeRelH>
-              </wp:inline>
+              <ns3:inline distT="0" distB="0" distL="0" distR="0">
+                <ns3:extent cx="5760720" cy="19050"/>
+                <ns3:effectExtent l="0" t="0" r="0" b="0"/>
+                <ns3:docPr id="1" name="Shape1"/>
+                <ns4:graphic>
+                  <ns4:graphicData uri="http://schemas.microsoft.com/office/word/2010/wordprocessingShape">
+                    <ns6:wsp>
+                      <ns6:cNvSpPr/>
+                      <ns6:spPr>
+                        <ns4:xfrm>
+                          <ns4:off x="0" y="0"/>
+                          <ns4:ext cx="5760720" cy="19080"/>
+                        </ns4:xfrm>
+                        <ns4:prstGeom prst="rect">
+                          <ns4:avLst/>
+                        </ns4:prstGeom>
+                        <ns4:solidFill>
+                          <ns4:srgbClr val="FFFFFF"/>
+                        </ns4:solidFill>
+                        <ns4:ln w="0">
+                          <ns4:solidFill>
+                            <ns4:srgbClr val="000000"/>
+                          </ns4:solidFill>
+                        </ns4:ln>
+                      </ns6:spPr>
+                      <ns6:style>
+                        <ns4:lnRef idx="0"/>
+                        <ns4:fillRef idx="0"/>
+                        <ns4:effectRef idx="0"/>
+                        <ns4:fontRef idx="minor"/>
+                      </ns6:style>
+                      <ns6:bodyPr/>
+                    </ns6:wsp>
+                  </ns4:graphicData>
+                </ns4:graphic>
+                <ns7:sizeRelH relativeFrom="page">
+                  <ns7:pctWidth>100000</ns7:pctWidth>
+                </ns7:sizeRelH>
+              </ns3:inline>
             </w:drawing>
-          </mc:Choice>
-          <mc:Fallback>
+          </ns1:Choice>
+          <ns1:Fallback>
             <w:pict>
-              <v:rect id="shape_0" fillcolor="white" stroked="t" o:allowincell="f" style="position:absolute;margin-left:0pt;margin-top:-1.55pt;width:453.55pt;height:1.45pt;mso-wrap-style:none;v-text-anchor:middle;mso-position-vertical:top">
-                <v:fill o:detectmouseclick="t" type="solid" color2="black"/>
-                <v:stroke color="black" joinstyle="round" endcap="flat"/>
-                <w10:wrap type="square"/>
-              </v:rect>
+              <ns8:rect id="shape_0" fillcolor="white" stroked="t" ns9:allowincell="f" style="position:absolute;margin-left:0pt;margin-top:-1.55pt;width:453.55pt;height:1.45pt;mso-wrap-style:none;v-text-anchor:middle;mso-position-vertical:top">
+                <ns8:fill ns9:detectmouseclick="t" type="solid" color2="black"/>
+                <ns8:stroke color="black" joinstyle="round" endcap="flat"/>
+                <ns10:wrap type="square"/>
+              </ns8:rect>
             </w:pict>
-          </mc:Fallback>
-        </mc:AlternateContent>
+          </ns1:Fallback>
+        </ns1:AlternateContent>
+      </w:r>
+    </w:p>
+    <w:p>
+      <w:pPr>
+        <w:pStyle w:val="BodyText"/>
+      </w:pPr>
+      <w:hyperlink r:id="rId25">
+        <w:r>
+          <w:rPr>
+            <w:rStyle w:val="Hyperlink"/>
+            <w:i w:val="0"/>
+          </w:rPr>
+          <w:t xml:space="preserve">Browse the full online instrument catalogue</w:t>
+        </w:r>
+      </w:hyperlink>
+      <w:r>
+        <w:rPr>
+          <w:i w:val="0"/>
+        </w:rPr>
+        <w:t xml:space="preserve"> to read or download every resource in HTML, Word, PDF, and spreadsheet formats.</w:t>
       </w:r>
     </w:p>
     <w:p>
@@ -891,60 +911,60 @@
       </w:pPr>
       <w:r>
         <w:rPr/>
-        <mc:AlternateContent>
-          <mc:Choice Requires="wps">
+        <ns1:AlternateContent>
+          <ns1:Choice Requires="wps">
             <w:drawing>
-              <wp:inline distT="0" distB="0" distL="0" distR="0">
-                <wp:extent cx="5760720" cy="19050"/>
-                <wp:effectExtent l="0" t="0" r="0" b="0"/>
-                <wp:docPr id="2" name="Shape2"/>
-                <a:graphic xmlns:a="http://schemas.openxmlformats.org/drawingml/2006/main">
-                  <a:graphicData uri="http://schemas.microsoft.com/office/word/2010/wordprocessingShape">
-                    <wps:wsp>
-                      <wps:cNvSpPr/>
-                      <wps:spPr>
-                        <a:xfrm>
-                          <a:off x="0" y="0"/>
-                          <a:ext cx="5760720" cy="19080"/>
-                        </a:xfrm>
-                        <a:prstGeom prst="rect">
-                          <a:avLst/>
-                        </a:prstGeom>
-                        <a:solidFill>
-                          <a:srgbClr val="FFFFFF"/>
-                        </a:solidFill>
-                        <a:ln w="0">
-                          <a:solidFill>
-                            <a:srgbClr val="000000"/>
-                          </a:solidFill>
-                        </a:ln>
-                      </wps:spPr>
-                      <wps:style>
-                        <a:lnRef idx="0"/>
-                        <a:fillRef idx="0"/>
-                        <a:effectRef idx="0"/>
-                        <a:fontRef idx="minor"/>
-                      </wps:style>
-                      <wps:bodyPr/>
-                    </wps:wsp>
-                  </a:graphicData>
-                </a:graphic>
-                <wp14:sizeRelH relativeFrom="page">
-                  <wp14:pctWidth>100000</wp14:pctWidth>
-                </wp14:sizeRelH>
-              </wp:inline>
+              <ns3:inline distT="0" distB="0" distL="0" distR="0">
+                <ns3:extent cx="5760720" cy="19050"/>
+                <ns3:effectExtent l="0" t="0" r="0" b="0"/>
+                <ns3:docPr id="2" name="Shape2"/>
+                <ns4:graphic>
+                  <ns4:graphicData uri="http://schemas.microsoft.com/office/word/2010/wordprocessingShape">
+                    <ns6:wsp>
+                      <ns6:cNvSpPr/>
+                      <ns6:spPr>
+                        <ns4:xfrm>
+                          <ns4:off x="0" y="0"/>
+                          <ns4:ext cx="5760720" cy="19080"/>
+                        </ns4:xfrm>
+                        <ns4:prstGeom prst="rect">
+                          <ns4:avLst/>
+                        </ns4:prstGeom>
+                        <ns4:solidFill>
+                          <ns4:srgbClr val="FFFFFF"/>
+                        </ns4:solidFill>
+                        <ns4:ln w="0">
+                          <ns4:solidFill>
+                            <ns4:srgbClr val="000000"/>
+                          </ns4:solidFill>
+                        </ns4:ln>
+                      </ns6:spPr>
+                      <ns6:style>
+                        <ns4:lnRef idx="0"/>
+                        <ns4:fillRef idx="0"/>
+                        <ns4:effectRef idx="0"/>
+                        <ns4:fontRef idx="minor"/>
+                      </ns6:style>
+                      <ns6:bodyPr/>
+                    </ns6:wsp>
+                  </ns4:graphicData>
+                </ns4:graphic>
+                <ns7:sizeRelH relativeFrom="page">
+                  <ns7:pctWidth>100000</ns7:pctWidth>
+                </ns7:sizeRelH>
+              </ns3:inline>
             </w:drawing>
-          </mc:Choice>
-          <mc:Fallback>
+          </ns1:Choice>
+          <ns1:Fallback>
             <w:pict>
-              <v:rect id="shape_0" fillcolor="white" stroked="t" o:allowincell="f" style="position:absolute;margin-left:0pt;margin-top:-1.55pt;width:453.55pt;height:1.45pt;mso-wrap-style:none;v-text-anchor:middle;mso-position-vertical:top">
-                <v:fill o:detectmouseclick="t" type="solid" color2="black"/>
-                <v:stroke color="black" joinstyle="round" endcap="flat"/>
-                <w10:wrap type="square"/>
-              </v:rect>
+              <ns8:rect id="shape_0" fillcolor="white" stroked="t" ns9:allowincell="f" style="position:absolute;margin-left:0pt;margin-top:-1.55pt;width:453.55pt;height:1.45pt;mso-wrap-style:none;v-text-anchor:middle;mso-position-vertical:top">
+                <ns8:fill ns9:detectmouseclick="t" type="solid" color2="black"/>
+                <ns8:stroke color="black" joinstyle="round" endcap="flat"/>
+                <ns10:wrap type="square"/>
+              </ns8:rect>
             </w:pict>
-          </mc:Fallback>
-        </mc:AlternateContent>
+          </ns1:Fallback>
+        </ns1:AlternateContent>
       </w:r>
       <w:bookmarkEnd w:id="1"/>
     </w:p>
@@ -1702,60 +1722,60 @@
       </w:pPr>
       <w:r>
         <w:rPr/>
-        <mc:AlternateContent>
-          <mc:Choice Requires="wps">
+        <ns1:AlternateContent>
+          <ns1:Choice Requires="wps">
             <w:drawing>
-              <wp:inline distT="0" distB="0" distL="0" distR="0">
-                <wp:extent cx="5760720" cy="19050"/>
-                <wp:effectExtent l="0" t="0" r="0" b="0"/>
-                <wp:docPr id="3" name="Shape3"/>
-                <a:graphic xmlns:a="http://schemas.openxmlformats.org/drawingml/2006/main">
-                  <a:graphicData uri="http://schemas.microsoft.com/office/word/2010/wordprocessingShape">
-                    <wps:wsp>
-                      <wps:cNvSpPr/>
-                      <wps:spPr>
-                        <a:xfrm>
-                          <a:off x="0" y="0"/>
-                          <a:ext cx="5760720" cy="19080"/>
-                        </a:xfrm>
-                        <a:prstGeom prst="rect">
-                          <a:avLst/>
-                        </a:prstGeom>
-                        <a:solidFill>
-                          <a:srgbClr val="FFFFFF"/>
-                        </a:solidFill>
-                        <a:ln w="0">
-                          <a:solidFill>
-                            <a:srgbClr val="000000"/>
-                          </a:solidFill>
-                        </a:ln>
-                      </wps:spPr>
-                      <wps:style>
-                        <a:lnRef idx="0"/>
-                        <a:fillRef idx="0"/>
-                        <a:effectRef idx="0"/>
-                        <a:fontRef idx="minor"/>
-                      </wps:style>
-                      <wps:bodyPr/>
-                    </wps:wsp>
-                  </a:graphicData>
-                </a:graphic>
-                <wp14:sizeRelH relativeFrom="page">
-                  <wp14:pctWidth>100000</wp14:pctWidth>
-                </wp14:sizeRelH>
-              </wp:inline>
+              <ns3:inline distT="0" distB="0" distL="0" distR="0">
+                <ns3:extent cx="5760720" cy="19050"/>
+                <ns3:effectExtent l="0" t="0" r="0" b="0"/>
+                <ns3:docPr id="3" name="Shape3"/>
+                <ns4:graphic>
+                  <ns4:graphicData uri="http://schemas.microsoft.com/office/word/2010/wordprocessingShape">
+                    <ns6:wsp>
+                      <ns6:cNvSpPr/>
+                      <ns6:spPr>
+                        <ns4:xfrm>
+                          <ns4:off x="0" y="0"/>
+                          <ns4:ext cx="5760720" cy="19080"/>
+                        </ns4:xfrm>
+                        <ns4:prstGeom prst="rect">
+                          <ns4:avLst/>
+                        </ns4:prstGeom>
+                        <ns4:solidFill>
+                          <ns4:srgbClr val="FFFFFF"/>
+                        </ns4:solidFill>
+                        <ns4:ln w="0">
+                          <ns4:solidFill>
+                            <ns4:srgbClr val="000000"/>
+                          </ns4:solidFill>
+                        </ns4:ln>
+                      </ns6:spPr>
+                      <ns6:style>
+                        <ns4:lnRef idx="0"/>
+                        <ns4:fillRef idx="0"/>
+                        <ns4:effectRef idx="0"/>
+                        <ns4:fontRef idx="minor"/>
+                      </ns6:style>
+                      <ns6:bodyPr/>
+                    </ns6:wsp>
+                  </ns4:graphicData>
+                </ns4:graphic>
+                <ns7:sizeRelH relativeFrom="page">
+                  <ns7:pctWidth>100000</ns7:pctWidth>
+                </ns7:sizeRelH>
+              </ns3:inline>
             </w:drawing>
-          </mc:Choice>
-          <mc:Fallback>
+          </ns1:Choice>
+          <ns1:Fallback>
             <w:pict>
-              <v:rect id="shape_0" fillcolor="white" stroked="t" o:allowincell="f" style="position:absolute;margin-left:0pt;margin-top:-1.55pt;width:453.55pt;height:1.45pt;mso-wrap-style:none;v-text-anchor:middle;mso-position-vertical:top">
-                <v:fill o:detectmouseclick="t" type="solid" color2="black"/>
-                <v:stroke color="black" joinstyle="round" endcap="flat"/>
-                <w10:wrap type="square"/>
-              </v:rect>
+              <ns8:rect id="shape_0" fillcolor="white" stroked="t" ns9:allowincell="f" style="position:absolute;margin-left:0pt;margin-top:-1.55pt;width:453.55pt;height:1.45pt;mso-wrap-style:none;v-text-anchor:middle;mso-position-vertical:top">
+                <ns8:fill ns9:detectmouseclick="t" type="solid" color2="black"/>
+                <ns8:stroke color="black" joinstyle="round" endcap="flat"/>
+                <ns10:wrap type="square"/>
+              </ns8:rect>
             </w:pict>
-          </mc:Fallback>
-        </mc:AlternateContent>
+          </ns1:Fallback>
+        </ns1:AlternateContent>
       </w:r>
       <w:bookmarkEnd w:id="2"/>
     </w:p>
@@ -1954,60 +1974,60 @@
       </w:pPr>
       <w:r>
         <w:rPr/>
-        <mc:AlternateContent>
-          <mc:Choice Requires="wps">
+        <ns1:AlternateContent>
+          <ns1:Choice Requires="wps">
             <w:drawing>
-              <wp:inline distT="0" distB="0" distL="0" distR="0">
-                <wp:extent cx="5760720" cy="19050"/>
-                <wp:effectExtent l="0" t="0" r="0" b="0"/>
-                <wp:docPr id="4" name="Shape4"/>
-                <a:graphic xmlns:a="http://schemas.openxmlformats.org/drawingml/2006/main">
-                  <a:graphicData uri="http://schemas.microsoft.com/office/word/2010/wordprocessingShape">
-                    <wps:wsp>
-                      <wps:cNvSpPr/>
-                      <wps:spPr>
-                        <a:xfrm>
-                          <a:off x="0" y="0"/>
-                          <a:ext cx="5760720" cy="19080"/>
-                        </a:xfrm>
-                        <a:prstGeom prst="rect">
-                          <a:avLst/>
-                        </a:prstGeom>
-                        <a:solidFill>
-                          <a:srgbClr val="FFFFFF"/>
-                        </a:solidFill>
-                        <a:ln w="0">
-                          <a:solidFill>
-                            <a:srgbClr val="000000"/>
-                          </a:solidFill>
-                        </a:ln>
-                      </wps:spPr>
-                      <wps:style>
-                        <a:lnRef idx="0"/>
-                        <a:fillRef idx="0"/>
-                        <a:effectRef idx="0"/>
-                        <a:fontRef idx="minor"/>
-                      </wps:style>
-                      <wps:bodyPr/>
-                    </wps:wsp>
-                  </a:graphicData>
-                </a:graphic>
-                <wp14:sizeRelH relativeFrom="page">
-                  <wp14:pctWidth>100000</wp14:pctWidth>
-                </wp14:sizeRelH>
-              </wp:inline>
+              <ns3:inline distT="0" distB="0" distL="0" distR="0">
+                <ns3:extent cx="5760720" cy="19050"/>
+                <ns3:effectExtent l="0" t="0" r="0" b="0"/>
+                <ns3:docPr id="4" name="Shape4"/>
+                <ns4:graphic>
+                  <ns4:graphicData uri="http://schemas.microsoft.com/office/word/2010/wordprocessingShape">
+                    <ns6:wsp>
+                      <ns6:cNvSpPr/>
+                      <ns6:spPr>
+                        <ns4:xfrm>
+                          <ns4:off x="0" y="0"/>
+                          <ns4:ext cx="5760720" cy="19080"/>
+                        </ns4:xfrm>
+                        <ns4:prstGeom prst="rect">
+                          <ns4:avLst/>
+                        </ns4:prstGeom>
+                        <ns4:solidFill>
+                          <ns4:srgbClr val="FFFFFF"/>
+                        </ns4:solidFill>
+                        <ns4:ln w="0">
+                          <ns4:solidFill>
+                            <ns4:srgbClr val="000000"/>
+                          </ns4:solidFill>
+                        </ns4:ln>
+                      </ns6:spPr>
+                      <ns6:style>
+                        <ns4:lnRef idx="0"/>
+                        <ns4:fillRef idx="0"/>
+                        <ns4:effectRef idx="0"/>
+                        <ns4:fontRef idx="minor"/>
+                      </ns6:style>
+                      <ns6:bodyPr/>
+                    </ns6:wsp>
+                  </ns4:graphicData>
+                </ns4:graphic>
+                <ns7:sizeRelH relativeFrom="page">
+                  <ns7:pctWidth>100000</ns7:pctWidth>
+                </ns7:sizeRelH>
+              </ns3:inline>
             </w:drawing>
-          </mc:Choice>
-          <mc:Fallback>
+          </ns1:Choice>
+          <ns1:Fallback>
             <w:pict>
-              <v:rect id="shape_0" fillcolor="white" stroked="t" o:allowincell="f" style="position:absolute;margin-left:0pt;margin-top:-1.55pt;width:453.55pt;height:1.45pt;mso-wrap-style:none;v-text-anchor:middle;mso-position-vertical:top">
-                <v:fill o:detectmouseclick="t" type="solid" color2="black"/>
-                <v:stroke color="black" joinstyle="round" endcap="flat"/>
-                <w10:wrap type="square"/>
-              </v:rect>
+              <ns8:rect id="shape_0" fillcolor="white" stroked="t" ns9:allowincell="f" style="position:absolute;margin-left:0pt;margin-top:-1.55pt;width:453.55pt;height:1.45pt;mso-wrap-style:none;v-text-anchor:middle;mso-position-vertical:top">
+                <ns8:fill ns9:detectmouseclick="t" type="solid" color2="black"/>
+                <ns8:stroke color="black" joinstyle="round" endcap="flat"/>
+                <ns10:wrap type="square"/>
+              </ns8:rect>
             </w:pict>
-          </mc:Fallback>
-        </mc:AlternateContent>
+          </ns1:Fallback>
+        </ns1:AlternateContent>
       </w:r>
       <w:bookmarkEnd w:id="3"/>
     </w:p>
@@ -2110,60 +2130,60 @@
       </w:pPr>
       <w:r>
         <w:rPr/>
-        <mc:AlternateContent>
-          <mc:Choice Requires="wps">
+        <ns1:AlternateContent>
+          <ns1:Choice Requires="wps">
             <w:drawing>
-              <wp:inline distT="0" distB="0" distL="0" distR="0">
-                <wp:extent cx="5760720" cy="19050"/>
-                <wp:effectExtent l="0" t="0" r="0" b="0"/>
-                <wp:docPr id="5" name="Shape5"/>
-                <a:graphic xmlns:a="http://schemas.openxmlformats.org/drawingml/2006/main">
-                  <a:graphicData uri="http://schemas.microsoft.com/office/word/2010/wordprocessingShape">
-                    <wps:wsp>
-                      <wps:cNvSpPr/>
-                      <wps:spPr>
-                        <a:xfrm>
-                          <a:off x="0" y="0"/>
-                          <a:ext cx="5760720" cy="19080"/>
-                        </a:xfrm>
-                        <a:prstGeom prst="rect">
-                          <a:avLst/>
-                        </a:prstGeom>
-                        <a:solidFill>
-                          <a:srgbClr val="FFFFFF"/>
-                        </a:solidFill>
-                        <a:ln w="0">
-                          <a:solidFill>
-                            <a:srgbClr val="000000"/>
-                          </a:solidFill>
-                        </a:ln>
-                      </wps:spPr>
-                      <wps:style>
-                        <a:lnRef idx="0"/>
-                        <a:fillRef idx="0"/>
-                        <a:effectRef idx="0"/>
-                        <a:fontRef idx="minor"/>
-                      </wps:style>
-                      <wps:bodyPr/>
-                    </wps:wsp>
-                  </a:graphicData>
-                </a:graphic>
-                <wp14:sizeRelH relativeFrom="page">
-                  <wp14:pctWidth>100000</wp14:pctWidth>
-                </wp14:sizeRelH>
-              </wp:inline>
+              <ns3:inline distT="0" distB="0" distL="0" distR="0">
+                <ns3:extent cx="5760720" cy="19050"/>
+                <ns3:effectExtent l="0" t="0" r="0" b="0"/>
+                <ns3:docPr id="5" name="Shape5"/>
+                <ns4:graphic>
+                  <ns4:graphicData uri="http://schemas.microsoft.com/office/word/2010/wordprocessingShape">
+                    <ns6:wsp>
+                      <ns6:cNvSpPr/>
+                      <ns6:spPr>
+                        <ns4:xfrm>
+                          <ns4:off x="0" y="0"/>
+                          <ns4:ext cx="5760720" cy="19080"/>
+                        </ns4:xfrm>
+                        <ns4:prstGeom prst="rect">
+                          <ns4:avLst/>
+                        </ns4:prstGeom>
+                        <ns4:solidFill>
+                          <ns4:srgbClr val="FFFFFF"/>
+                        </ns4:solidFill>
+                        <ns4:ln w="0">
+                          <ns4:solidFill>
+                            <ns4:srgbClr val="000000"/>
+                          </ns4:solidFill>
+                        </ns4:ln>
+                      </ns6:spPr>
+                      <ns6:style>
+                        <ns4:lnRef idx="0"/>
+                        <ns4:fillRef idx="0"/>
+                        <ns4:effectRef idx="0"/>
+                        <ns4:fontRef idx="minor"/>
+                      </ns6:style>
+                      <ns6:bodyPr/>
+                    </ns6:wsp>
+                  </ns4:graphicData>
+                </ns4:graphic>
+                <ns7:sizeRelH relativeFrom="page">
+                  <ns7:pctWidth>100000</ns7:pctWidth>
+                </ns7:sizeRelH>
+              </ns3:inline>
             </w:drawing>
-          </mc:Choice>
-          <mc:Fallback>
+          </ns1:Choice>
+          <ns1:Fallback>
             <w:pict>
-              <v:rect id="shape_0" fillcolor="white" stroked="t" o:allowincell="f" style="position:absolute;margin-left:0pt;margin-top:-1.55pt;width:453.55pt;height:1.45pt;mso-wrap-style:none;v-text-anchor:middle;mso-position-vertical:top">
-                <v:fill o:detectmouseclick="t" type="solid" color2="black"/>
-                <v:stroke color="black" joinstyle="round" endcap="flat"/>
-                <w10:wrap type="square"/>
-              </v:rect>
+              <ns8:rect id="shape_0" fillcolor="white" stroked="t" ns9:allowincell="f" style="position:absolute;margin-left:0pt;margin-top:-1.55pt;width:453.55pt;height:1.45pt;mso-wrap-style:none;v-text-anchor:middle;mso-position-vertical:top">
+                <ns8:fill ns9:detectmouseclick="t" type="solid" color2="black"/>
+                <ns8:stroke color="black" joinstyle="round" endcap="flat"/>
+                <ns10:wrap type="square"/>
+              </ns8:rect>
             </w:pict>
-          </mc:Fallback>
-        </mc:AlternateContent>
+          </ns1:Fallback>
+        </ns1:AlternateContent>
       </w:r>
       <w:bookmarkEnd w:id="4"/>
     </w:p>
@@ -2633,60 +2653,60 @@
       </w:pPr>
       <w:r>
         <w:rPr/>
-        <mc:AlternateContent>
-          <mc:Choice Requires="wps">
+        <ns1:AlternateContent>
+          <ns1:Choice Requires="wps">
             <w:drawing>
-              <wp:inline distT="0" distB="0" distL="0" distR="0">
-                <wp:extent cx="5760720" cy="19050"/>
-                <wp:effectExtent l="0" t="0" r="0" b="0"/>
-                <wp:docPr id="6" name="Shape6"/>
-                <a:graphic xmlns:a="http://schemas.openxmlformats.org/drawingml/2006/main">
-                  <a:graphicData uri="http://schemas.microsoft.com/office/word/2010/wordprocessingShape">
-                    <wps:wsp>
-                      <wps:cNvSpPr/>
-                      <wps:spPr>
-                        <a:xfrm>
-                          <a:off x="0" y="0"/>
-                          <a:ext cx="5760720" cy="19080"/>
-                        </a:xfrm>
-                        <a:prstGeom prst="rect">
-                          <a:avLst/>
-                        </a:prstGeom>
-                        <a:solidFill>
-                          <a:srgbClr val="FFFFFF"/>
-                        </a:solidFill>
-                        <a:ln w="0">
-                          <a:solidFill>
-                            <a:srgbClr val="000000"/>
-                          </a:solidFill>
-                        </a:ln>
-                      </wps:spPr>
-                      <wps:style>
-                        <a:lnRef idx="0"/>
-                        <a:fillRef idx="0"/>
-                        <a:effectRef idx="0"/>
-                        <a:fontRef idx="minor"/>
-                      </wps:style>
-                      <wps:bodyPr/>
-                    </wps:wsp>
-                  </a:graphicData>
-                </a:graphic>
-                <wp14:sizeRelH relativeFrom="page">
-                  <wp14:pctWidth>100000</wp14:pctWidth>
-                </wp14:sizeRelH>
-              </wp:inline>
+              <ns3:inline distT="0" distB="0" distL="0" distR="0">
+                <ns3:extent cx="5760720" cy="19050"/>
+                <ns3:effectExtent l="0" t="0" r="0" b="0"/>
+                <ns3:docPr id="6" name="Shape6"/>
+                <ns4:graphic>
+                  <ns4:graphicData uri="http://schemas.microsoft.com/office/word/2010/wordprocessingShape">
+                    <ns6:wsp>
+                      <ns6:cNvSpPr/>
+                      <ns6:spPr>
+                        <ns4:xfrm>
+                          <ns4:off x="0" y="0"/>
+                          <ns4:ext cx="5760720" cy="19080"/>
+                        </ns4:xfrm>
+                        <ns4:prstGeom prst="rect">
+                          <ns4:avLst/>
+                        </ns4:prstGeom>
+                        <ns4:solidFill>
+                          <ns4:srgbClr val="FFFFFF"/>
+                        </ns4:solidFill>
+                        <ns4:ln w="0">
+                          <ns4:solidFill>
+                            <ns4:srgbClr val="000000"/>
+                          </ns4:solidFill>
+                        </ns4:ln>
+                      </ns6:spPr>
+                      <ns6:style>
+                        <ns4:lnRef idx="0"/>
+                        <ns4:fillRef idx="0"/>
+                        <ns4:effectRef idx="0"/>
+                        <ns4:fontRef idx="minor"/>
+                      </ns6:style>
+                      <ns6:bodyPr/>
+                    </ns6:wsp>
+                  </ns4:graphicData>
+                </ns4:graphic>
+                <ns7:sizeRelH relativeFrom="page">
+                  <ns7:pctWidth>100000</ns7:pctWidth>
+                </ns7:sizeRelH>
+              </ns3:inline>
             </w:drawing>
-          </mc:Choice>
-          <mc:Fallback>
+          </ns1:Choice>
+          <ns1:Fallback>
             <w:pict>
-              <v:rect id="shape_0" fillcolor="white" stroked="t" o:allowincell="f" style="position:absolute;margin-left:0pt;margin-top:-1.55pt;width:453.55pt;height:1.45pt;mso-wrap-style:none;v-text-anchor:middle;mso-position-vertical:top">
-                <v:fill o:detectmouseclick="t" type="solid" color2="black"/>
-                <v:stroke color="black" joinstyle="round" endcap="flat"/>
-                <w10:wrap type="square"/>
-              </v:rect>
+              <ns8:rect id="shape_0" fillcolor="white" stroked="t" ns9:allowincell="f" style="position:absolute;margin-left:0pt;margin-top:-1.55pt;width:453.55pt;height:1.45pt;mso-wrap-style:none;v-text-anchor:middle;mso-position-vertical:top">
+                <ns8:fill ns9:detectmouseclick="t" type="solid" color2="black"/>
+                <ns8:stroke color="black" joinstyle="round" endcap="flat"/>
+                <ns10:wrap type="square"/>
+              </ns8:rect>
             </w:pict>
-          </mc:Fallback>
-        </mc:AlternateContent>
+          </ns1:Fallback>
+        </ns1:AlternateContent>
       </w:r>
       <w:bookmarkEnd w:id="5"/>
     </w:p>
@@ -3156,60 +3176,60 @@
       </w:pPr>
       <w:r>
         <w:rPr/>
-        <mc:AlternateContent>
-          <mc:Choice Requires="wps">
+        <ns1:AlternateContent>
+          <ns1:Choice Requires="wps">
             <w:drawing>
-              <wp:inline distT="0" distB="0" distL="0" distR="0">
-                <wp:extent cx="5760720" cy="19050"/>
-                <wp:effectExtent l="0" t="0" r="0" b="0"/>
-                <wp:docPr id="7" name="Shape7"/>
-                <a:graphic xmlns:a="http://schemas.openxmlformats.org/drawingml/2006/main">
-                  <a:graphicData uri="http://schemas.microsoft.com/office/word/2010/wordprocessingShape">
-                    <wps:wsp>
-                      <wps:cNvSpPr/>
-                      <wps:spPr>
-                        <a:xfrm>
-                          <a:off x="0" y="0"/>
-                          <a:ext cx="5760720" cy="19080"/>
-                        </a:xfrm>
-                        <a:prstGeom prst="rect">
-                          <a:avLst/>
-                        </a:prstGeom>
-                        <a:solidFill>
-                          <a:srgbClr val="FFFFFF"/>
-                        </a:solidFill>
-                        <a:ln w="0">
-                          <a:solidFill>
-                            <a:srgbClr val="000000"/>
-                          </a:solidFill>
-                        </a:ln>
-                      </wps:spPr>
-                      <wps:style>
-                        <a:lnRef idx="0"/>
-                        <a:fillRef idx="0"/>
-                        <a:effectRef idx="0"/>
-                        <a:fontRef idx="minor"/>
-                      </wps:style>
-                      <wps:bodyPr/>
-                    </wps:wsp>
-                  </a:graphicData>
-                </a:graphic>
-                <wp14:sizeRelH relativeFrom="page">
-                  <wp14:pctWidth>100000</wp14:pctWidth>
-                </wp14:sizeRelH>
-              </wp:inline>
+              <ns3:inline distT="0" distB="0" distL="0" distR="0">
+                <ns3:extent cx="5760720" cy="19050"/>
+                <ns3:effectExtent l="0" t="0" r="0" b="0"/>
+                <ns3:docPr id="7" name="Shape7"/>
+                <ns4:graphic>
+                  <ns4:graphicData uri="http://schemas.microsoft.com/office/word/2010/wordprocessingShape">
+                    <ns6:wsp>
+                      <ns6:cNvSpPr/>
+                      <ns6:spPr>
+                        <ns4:xfrm>
+                          <ns4:off x="0" y="0"/>
+                          <ns4:ext cx="5760720" cy="19080"/>
+                        </ns4:xfrm>
+                        <ns4:prstGeom prst="rect">
+                          <ns4:avLst/>
+                        </ns4:prstGeom>
+                        <ns4:solidFill>
+                          <ns4:srgbClr val="FFFFFF"/>
+                        </ns4:solidFill>
+                        <ns4:ln w="0">
+                          <ns4:solidFill>
+                            <ns4:srgbClr val="000000"/>
+                          </ns4:solidFill>
+                        </ns4:ln>
+                      </ns6:spPr>
+                      <ns6:style>
+                        <ns4:lnRef idx="0"/>
+                        <ns4:fillRef idx="0"/>
+                        <ns4:effectRef idx="0"/>
+                        <ns4:fontRef idx="minor"/>
+                      </ns6:style>
+                      <ns6:bodyPr/>
+                    </ns6:wsp>
+                  </ns4:graphicData>
+                </ns4:graphic>
+                <ns7:sizeRelH relativeFrom="page">
+                  <ns7:pctWidth>100000</ns7:pctWidth>
+                </ns7:sizeRelH>
+              </ns3:inline>
             </w:drawing>
-          </mc:Choice>
-          <mc:Fallback>
+          </ns1:Choice>
+          <ns1:Fallback>
             <w:pict>
-              <v:rect id="shape_0" fillcolor="white" stroked="t" o:allowincell="f" style="position:absolute;margin-left:0pt;margin-top:-1.55pt;width:453.55pt;height:1.45pt;mso-wrap-style:none;v-text-anchor:middle;mso-position-vertical:top">
-                <v:fill o:detectmouseclick="t" type="solid" color2="black"/>
-                <v:stroke color="black" joinstyle="round" endcap="flat"/>
-                <w10:wrap type="square"/>
-              </v:rect>
+              <ns8:rect id="shape_0" fillcolor="white" stroked="t" ns9:allowincell="f" style="position:absolute;margin-left:0pt;margin-top:-1.55pt;width:453.55pt;height:1.45pt;mso-wrap-style:none;v-text-anchor:middle;mso-position-vertical:top">
+                <ns8:fill ns9:detectmouseclick="t" type="solid" color2="black"/>
+                <ns8:stroke color="black" joinstyle="round" endcap="flat"/>
+                <ns10:wrap type="square"/>
+              </ns8:rect>
             </w:pict>
-          </mc:Fallback>
-        </mc:AlternateContent>
+          </ns1:Fallback>
+        </ns1:AlternateContent>
       </w:r>
       <w:bookmarkEnd w:id="6"/>
     </w:p>
@@ -3649,60 +3669,60 @@
       </w:pPr>
       <w:r>
         <w:rPr/>
-        <mc:AlternateContent>
-          <mc:Choice Requires="wps">
+        <ns1:AlternateContent>
+          <ns1:Choice Requires="wps">
             <w:drawing>
-              <wp:inline distT="0" distB="0" distL="0" distR="0">
-                <wp:extent cx="5760720" cy="19050"/>
-                <wp:effectExtent l="0" t="0" r="0" b="0"/>
-                <wp:docPr id="8" name="Shape8"/>
-                <a:graphic xmlns:a="http://schemas.openxmlformats.org/drawingml/2006/main">
-                  <a:graphicData uri="http://schemas.microsoft.com/office/word/2010/wordprocessingShape">
-                    <wps:wsp>
-                      <wps:cNvSpPr/>
-                      <wps:spPr>
-                        <a:xfrm>
-                          <a:off x="0" y="0"/>
-                          <a:ext cx="5760720" cy="19080"/>
-                        </a:xfrm>
-                        <a:prstGeom prst="rect">
-                          <a:avLst/>
-                        </a:prstGeom>
-                        <a:solidFill>
-                          <a:srgbClr val="FFFFFF"/>
-                        </a:solidFill>
-                        <a:ln w="0">
-                          <a:solidFill>
-                            <a:srgbClr val="000000"/>
-                          </a:solidFill>
-                        </a:ln>
-                      </wps:spPr>
-                      <wps:style>
-                        <a:lnRef idx="0"/>
-                        <a:fillRef idx="0"/>
-                        <a:effectRef idx="0"/>
-                        <a:fontRef idx="minor"/>
-                      </wps:style>
-                      <wps:bodyPr/>
-                    </wps:wsp>
-                  </a:graphicData>
-                </a:graphic>
-                <wp14:sizeRelH relativeFrom="page">
-                  <wp14:pctWidth>100000</wp14:pctWidth>
-                </wp14:sizeRelH>
-              </wp:inline>
+              <ns3:inline distT="0" distB="0" distL="0" distR="0">
+                <ns3:extent cx="5760720" cy="19050"/>
+                <ns3:effectExtent l="0" t="0" r="0" b="0"/>
+                <ns3:docPr id="8" name="Shape8"/>
+                <ns4:graphic>
+                  <ns4:graphicData uri="http://schemas.microsoft.com/office/word/2010/wordprocessingShape">
+                    <ns6:wsp>
+                      <ns6:cNvSpPr/>
+                      <ns6:spPr>
+                        <ns4:xfrm>
+                          <ns4:off x="0" y="0"/>
+                          <ns4:ext cx="5760720" cy="19080"/>
+                        </ns4:xfrm>
+                        <ns4:prstGeom prst="rect">
+                          <ns4:avLst/>
+                        </ns4:prstGeom>
+                        <ns4:solidFill>
+                          <ns4:srgbClr val="FFFFFF"/>
+                        </ns4:solidFill>
+                        <ns4:ln w="0">
+                          <ns4:solidFill>
+                            <ns4:srgbClr val="000000"/>
+                          </ns4:solidFill>
+                        </ns4:ln>
+                      </ns6:spPr>
+                      <ns6:style>
+                        <ns4:lnRef idx="0"/>
+                        <ns4:fillRef idx="0"/>
+                        <ns4:effectRef idx="0"/>
+                        <ns4:fontRef idx="minor"/>
+                      </ns6:style>
+                      <ns6:bodyPr/>
+                    </ns6:wsp>
+                  </ns4:graphicData>
+                </ns4:graphic>
+                <ns7:sizeRelH relativeFrom="page">
+                  <ns7:pctWidth>100000</ns7:pctWidth>
+                </ns7:sizeRelH>
+              </ns3:inline>
             </w:drawing>
-          </mc:Choice>
-          <mc:Fallback>
+          </ns1:Choice>
+          <ns1:Fallback>
             <w:pict>
-              <v:rect id="shape_0" fillcolor="white" stroked="t" o:allowincell="f" style="position:absolute;margin-left:0pt;margin-top:-1.55pt;width:453.55pt;height:1.45pt;mso-wrap-style:none;v-text-anchor:middle;mso-position-vertical:top">
-                <v:fill o:detectmouseclick="t" type="solid" color2="black"/>
-                <v:stroke color="black" joinstyle="round" endcap="flat"/>
-                <w10:wrap type="square"/>
-              </v:rect>
+              <ns8:rect id="shape_0" fillcolor="white" stroked="t" ns9:allowincell="f" style="position:absolute;margin-left:0pt;margin-top:-1.55pt;width:453.55pt;height:1.45pt;mso-wrap-style:none;v-text-anchor:middle;mso-position-vertical:top">
+                <ns8:fill ns9:detectmouseclick="t" type="solid" color2="black"/>
+                <ns8:stroke color="black" joinstyle="round" endcap="flat"/>
+                <ns10:wrap type="square"/>
+              </ns8:rect>
             </w:pict>
-          </mc:Fallback>
-        </mc:AlternateContent>
+          </ns1:Fallback>
+        </ns1:AlternateContent>
       </w:r>
       <w:bookmarkEnd w:id="7"/>
     </w:p>
@@ -4142,60 +4162,60 @@
       </w:pPr>
       <w:r>
         <w:rPr/>
-        <mc:AlternateContent>
-          <mc:Choice Requires="wps">
+        <ns1:AlternateContent>
+          <ns1:Choice Requires="wps">
             <w:drawing>
-              <wp:inline distT="0" distB="0" distL="0" distR="0">
-                <wp:extent cx="5760720" cy="19050"/>
-                <wp:effectExtent l="0" t="0" r="0" b="0"/>
-                <wp:docPr id="9" name="Shape9"/>
-                <a:graphic xmlns:a="http://schemas.openxmlformats.org/drawingml/2006/main">
-                  <a:graphicData uri="http://schemas.microsoft.com/office/word/2010/wordprocessingShape">
-                    <wps:wsp>
-                      <wps:cNvSpPr/>
-                      <wps:spPr>
-                        <a:xfrm>
-                          <a:off x="0" y="0"/>
-                          <a:ext cx="5760720" cy="19080"/>
-                        </a:xfrm>
-                        <a:prstGeom prst="rect">
-                          <a:avLst/>
-                        </a:prstGeom>
-                        <a:solidFill>
-                          <a:srgbClr val="FFFFFF"/>
-                        </a:solidFill>
-                        <a:ln w="0">
-                          <a:solidFill>
-                            <a:srgbClr val="000000"/>
-                          </a:solidFill>
-                        </a:ln>
-                      </wps:spPr>
-                      <wps:style>
-                        <a:lnRef idx="0"/>
-                        <a:fillRef idx="0"/>
-                        <a:effectRef idx="0"/>
-                        <a:fontRef idx="minor"/>
-                      </wps:style>
-                      <wps:bodyPr/>
-                    </wps:wsp>
-                  </a:graphicData>
-                </a:graphic>
-                <wp14:sizeRelH relativeFrom="page">
-                  <wp14:pctWidth>100000</wp14:pctWidth>
-                </wp14:sizeRelH>
-              </wp:inline>
+              <ns3:inline distT="0" distB="0" distL="0" distR="0">
+                <ns3:extent cx="5760720" cy="19050"/>
+                <ns3:effectExtent l="0" t="0" r="0" b="0"/>
+                <ns3:docPr id="9" name="Shape9"/>
+                <ns4:graphic>
+                  <ns4:graphicData uri="http://schemas.microsoft.com/office/word/2010/wordprocessingShape">
+                    <ns6:wsp>
+                      <ns6:cNvSpPr/>
+                      <ns6:spPr>
+                        <ns4:xfrm>
+                          <ns4:off x="0" y="0"/>
+                          <ns4:ext cx="5760720" cy="19080"/>
+                        </ns4:xfrm>
+                        <ns4:prstGeom prst="rect">
+                          <ns4:avLst/>
+                        </ns4:prstGeom>
+                        <ns4:solidFill>
+                          <ns4:srgbClr val="FFFFFF"/>
+                        </ns4:solidFill>
+                        <ns4:ln w="0">
+                          <ns4:solidFill>
+                            <ns4:srgbClr val="000000"/>
+                          </ns4:solidFill>
+                        </ns4:ln>
+                      </ns6:spPr>
+                      <ns6:style>
+                        <ns4:lnRef idx="0"/>
+                        <ns4:fillRef idx="0"/>
+                        <ns4:effectRef idx="0"/>
+                        <ns4:fontRef idx="minor"/>
+                      </ns6:style>
+                      <ns6:bodyPr/>
+                    </ns6:wsp>
+                  </ns4:graphicData>
+                </ns4:graphic>
+                <ns7:sizeRelH relativeFrom="page">
+                  <ns7:pctWidth>100000</ns7:pctWidth>
+                </ns7:sizeRelH>
+              </ns3:inline>
             </w:drawing>
-          </mc:Choice>
-          <mc:Fallback>
+          </ns1:Choice>
+          <ns1:Fallback>
             <w:pict>
-              <v:rect id="shape_0" fillcolor="white" stroked="t" o:allowincell="f" style="position:absolute;margin-left:0pt;margin-top:-1.55pt;width:453.55pt;height:1.45pt;mso-wrap-style:none;v-text-anchor:middle;mso-position-vertical:top">
-                <v:fill o:detectmouseclick="t" type="solid" color2="black"/>
-                <v:stroke color="black" joinstyle="round" endcap="flat"/>
-                <w10:wrap type="square"/>
-              </v:rect>
+              <ns8:rect id="shape_0" fillcolor="white" stroked="t" ns9:allowincell="f" style="position:absolute;margin-left:0pt;margin-top:-1.55pt;width:453.55pt;height:1.45pt;mso-wrap-style:none;v-text-anchor:middle;mso-position-vertical:top">
+                <ns8:fill ns9:detectmouseclick="t" type="solid" color2="black"/>
+                <ns8:stroke color="black" joinstyle="round" endcap="flat"/>
+                <ns10:wrap type="square"/>
+              </ns8:rect>
             </w:pict>
-          </mc:Fallback>
-        </mc:AlternateContent>
+          </ns1:Fallback>
+        </ns1:AlternateContent>
       </w:r>
       <w:bookmarkEnd w:id="8"/>
     </w:p>
@@ -4610,60 +4630,60 @@
       </w:pPr>
       <w:r>
         <w:rPr/>
-        <mc:AlternateContent>
-          <mc:Choice Requires="wps">
+        <ns1:AlternateContent>
+          <ns1:Choice Requires="wps">
             <w:drawing>
-              <wp:inline distT="0" distB="0" distL="0" distR="0">
-                <wp:extent cx="5760720" cy="19050"/>
-                <wp:effectExtent l="0" t="0" r="0" b="0"/>
-                <wp:docPr id="10" name="Shape10"/>
-                <a:graphic xmlns:a="http://schemas.openxmlformats.org/drawingml/2006/main">
-                  <a:graphicData uri="http://schemas.microsoft.com/office/word/2010/wordprocessingShape">
-                    <wps:wsp>
-                      <wps:cNvSpPr/>
-                      <wps:spPr>
-                        <a:xfrm>
-                          <a:off x="0" y="0"/>
-                          <a:ext cx="5760720" cy="19080"/>
-                        </a:xfrm>
-                        <a:prstGeom prst="rect">
-                          <a:avLst/>
-                        </a:prstGeom>
-                        <a:solidFill>
-                          <a:srgbClr val="FFFFFF"/>
-                        </a:solidFill>
-                        <a:ln w="0">
-                          <a:solidFill>
-                            <a:srgbClr val="000000"/>
-                          </a:solidFill>
-                        </a:ln>
-                      </wps:spPr>
-                      <wps:style>
-                        <a:lnRef idx="0"/>
-                        <a:fillRef idx="0"/>
-                        <a:effectRef idx="0"/>
-                        <a:fontRef idx="minor"/>
-                      </wps:style>
-                      <wps:bodyPr/>
-                    </wps:wsp>
-                  </a:graphicData>
-                </a:graphic>
-                <wp14:sizeRelH relativeFrom="page">
-                  <wp14:pctWidth>100000</wp14:pctWidth>
-                </wp14:sizeRelH>
-              </wp:inline>
+              <ns3:inline distT="0" distB="0" distL="0" distR="0">
+                <ns3:extent cx="5760720" cy="19050"/>
+                <ns3:effectExtent l="0" t="0" r="0" b="0"/>
+                <ns3:docPr id="10" name="Shape10"/>
+                <ns4:graphic>
+                  <ns4:graphicData uri="http://schemas.microsoft.com/office/word/2010/wordprocessingShape">
+                    <ns6:wsp>
+                      <ns6:cNvSpPr/>
+                      <ns6:spPr>
+                        <ns4:xfrm>
+                          <ns4:off x="0" y="0"/>
+                          <ns4:ext cx="5760720" cy="19080"/>
+                        </ns4:xfrm>
+                        <ns4:prstGeom prst="rect">
+                          <ns4:avLst/>
+                        </ns4:prstGeom>
+                        <ns4:solidFill>
+                          <ns4:srgbClr val="FFFFFF"/>
+                        </ns4:solidFill>
+                        <ns4:ln w="0">
+                          <ns4:solidFill>
+                            <ns4:srgbClr val="000000"/>
+                          </ns4:solidFill>
+                        </ns4:ln>
+                      </ns6:spPr>
+                      <ns6:style>
+                        <ns4:lnRef idx="0"/>
+                        <ns4:fillRef idx="0"/>
+                        <ns4:effectRef idx="0"/>
+                        <ns4:fontRef idx="minor"/>
+                      </ns6:style>
+                      <ns6:bodyPr/>
+                    </ns6:wsp>
+                  </ns4:graphicData>
+                </ns4:graphic>
+                <ns7:sizeRelH relativeFrom="page">
+                  <ns7:pctWidth>100000</ns7:pctWidth>
+                </ns7:sizeRelH>
+              </ns3:inline>
             </w:drawing>
-          </mc:Choice>
-          <mc:Fallback>
+          </ns1:Choice>
+          <ns1:Fallback>
             <w:pict>
-              <v:rect id="shape_0" fillcolor="white" stroked="t" o:allowincell="f" style="position:absolute;margin-left:0pt;margin-top:-1.55pt;width:453.55pt;height:1.45pt;mso-wrap-style:none;v-text-anchor:middle;mso-position-vertical:top">
-                <v:fill o:detectmouseclick="t" type="solid" color2="black"/>
-                <v:stroke color="black" joinstyle="round" endcap="flat"/>
-                <w10:wrap type="square"/>
-              </v:rect>
+              <ns8:rect id="shape_0" fillcolor="white" stroked="t" ns9:allowincell="f" style="position:absolute;margin-left:0pt;margin-top:-1.55pt;width:453.55pt;height:1.45pt;mso-wrap-style:none;v-text-anchor:middle;mso-position-vertical:top">
+                <ns8:fill ns9:detectmouseclick="t" type="solid" color2="black"/>
+                <ns8:stroke color="black" joinstyle="round" endcap="flat"/>
+                <ns10:wrap type="square"/>
+              </ns8:rect>
             </w:pict>
-          </mc:Fallback>
-        </mc:AlternateContent>
+          </ns1:Fallback>
+        </ns1:AlternateContent>
       </w:r>
       <w:bookmarkEnd w:id="9"/>
     </w:p>
@@ -4848,60 +4868,60 @@
       </w:pPr>
       <w:r>
         <w:rPr/>
-        <mc:AlternateContent>
-          <mc:Choice Requires="wps">
+        <ns1:AlternateContent>
+          <ns1:Choice Requires="wps">
             <w:drawing>
-              <wp:inline distT="0" distB="0" distL="0" distR="0">
-                <wp:extent cx="5760720" cy="19050"/>
-                <wp:effectExtent l="0" t="0" r="0" b="0"/>
-                <wp:docPr id="11" name="Shape11"/>
-                <a:graphic xmlns:a="http://schemas.openxmlformats.org/drawingml/2006/main">
-                  <a:graphicData uri="http://schemas.microsoft.com/office/word/2010/wordprocessingShape">
-                    <wps:wsp>
-                      <wps:cNvSpPr/>
-                      <wps:spPr>
-                        <a:xfrm>
-                          <a:off x="0" y="0"/>
-                          <a:ext cx="5760720" cy="19080"/>
-                        </a:xfrm>
-                        <a:prstGeom prst="rect">
-                          <a:avLst/>
-                        </a:prstGeom>
-                        <a:solidFill>
-                          <a:srgbClr val="FFFFFF"/>
-                        </a:solidFill>
-                        <a:ln w="0">
-                          <a:solidFill>
-                            <a:srgbClr val="000000"/>
-                          </a:solidFill>
-                        </a:ln>
-                      </wps:spPr>
-                      <wps:style>
-                        <a:lnRef idx="0"/>
-                        <a:fillRef idx="0"/>
-                        <a:effectRef idx="0"/>
-                        <a:fontRef idx="minor"/>
-                      </wps:style>
-                      <wps:bodyPr/>
-                    </wps:wsp>
-                  </a:graphicData>
-                </a:graphic>
-                <wp14:sizeRelH relativeFrom="page">
-                  <wp14:pctWidth>100000</wp14:pctWidth>
-                </wp14:sizeRelH>
-              </wp:inline>
+              <ns3:inline distT="0" distB="0" distL="0" distR="0">
+                <ns3:extent cx="5760720" cy="19050"/>
+                <ns3:effectExtent l="0" t="0" r="0" b="0"/>
+                <ns3:docPr id="11" name="Shape11"/>
+                <ns4:graphic>
+                  <ns4:graphicData uri="http://schemas.microsoft.com/office/word/2010/wordprocessingShape">
+                    <ns6:wsp>
+                      <ns6:cNvSpPr/>
+                      <ns6:spPr>
+                        <ns4:xfrm>
+                          <ns4:off x="0" y="0"/>
+                          <ns4:ext cx="5760720" cy="19080"/>
+                        </ns4:xfrm>
+                        <ns4:prstGeom prst="rect">
+                          <ns4:avLst/>
+                        </ns4:prstGeom>
+                        <ns4:solidFill>
+                          <ns4:srgbClr val="FFFFFF"/>
+                        </ns4:solidFill>
+                        <ns4:ln w="0">
+                          <ns4:solidFill>
+                            <ns4:srgbClr val="000000"/>
+                          </ns4:solidFill>
+                        </ns4:ln>
+                      </ns6:spPr>
+                      <ns6:style>
+                        <ns4:lnRef idx="0"/>
+                        <ns4:fillRef idx="0"/>
+                        <ns4:effectRef idx="0"/>
+                        <ns4:fontRef idx="minor"/>
+                      </ns6:style>
+                      <ns6:bodyPr/>
+                    </ns6:wsp>
+                  </ns4:graphicData>
+                </ns4:graphic>
+                <ns7:sizeRelH relativeFrom="page">
+                  <ns7:pctWidth>100000</ns7:pctWidth>
+                </ns7:sizeRelH>
+              </ns3:inline>
             </w:drawing>
-          </mc:Choice>
-          <mc:Fallback>
+          </ns1:Choice>
+          <ns1:Fallback>
             <w:pict>
-              <v:rect id="shape_0" fillcolor="white" stroked="t" o:allowincell="f" style="position:absolute;margin-left:0pt;margin-top:-1.55pt;width:453.55pt;height:1.45pt;mso-wrap-style:none;v-text-anchor:middle;mso-position-vertical:top">
-                <v:fill o:detectmouseclick="t" type="solid" color2="black"/>
-                <v:stroke color="black" joinstyle="round" endcap="flat"/>
-                <w10:wrap type="square"/>
-              </v:rect>
+              <ns8:rect id="shape_0" fillcolor="white" stroked="t" ns9:allowincell="f" style="position:absolute;margin-left:0pt;margin-top:-1.55pt;width:453.55pt;height:1.45pt;mso-wrap-style:none;v-text-anchor:middle;mso-position-vertical:top">
+                <ns8:fill ns9:detectmouseclick="t" type="solid" color2="black"/>
+                <ns8:stroke color="black" joinstyle="round" endcap="flat"/>
+                <ns10:wrap type="square"/>
+              </ns8:rect>
             </w:pict>
-          </mc:Fallback>
-        </mc:AlternateContent>
+          </ns1:Fallback>
+        </ns1:AlternateContent>
       </w:r>
       <w:bookmarkEnd w:id="10"/>
     </w:p>
@@ -5070,60 +5090,60 @@
       </w:pPr>
       <w:r>
         <w:rPr/>
-        <mc:AlternateContent>
-          <mc:Choice Requires="wps">
+        <ns1:AlternateContent>
+          <ns1:Choice Requires="wps">
             <w:drawing>
-              <wp:inline distT="0" distB="0" distL="0" distR="0">
-                <wp:extent cx="5760720" cy="19050"/>
-                <wp:effectExtent l="0" t="0" r="0" b="0"/>
-                <wp:docPr id="12" name="Shape12"/>
-                <a:graphic xmlns:a="http://schemas.openxmlformats.org/drawingml/2006/main">
-                  <a:graphicData uri="http://schemas.microsoft.com/office/word/2010/wordprocessingShape">
-                    <wps:wsp>
-                      <wps:cNvSpPr/>
-                      <wps:spPr>
-                        <a:xfrm>
-                          <a:off x="0" y="0"/>
-                          <a:ext cx="5760720" cy="19080"/>
-                        </a:xfrm>
-                        <a:prstGeom prst="rect">
-                          <a:avLst/>
-                        </a:prstGeom>
-                        <a:solidFill>
-                          <a:srgbClr val="FFFFFF"/>
-                        </a:solidFill>
-                        <a:ln w="0">
-                          <a:solidFill>
-                            <a:srgbClr val="000000"/>
-                          </a:solidFill>
-                        </a:ln>
-                      </wps:spPr>
-                      <wps:style>
-                        <a:lnRef idx="0"/>
-                        <a:fillRef idx="0"/>
-                        <a:effectRef idx="0"/>
-                        <a:fontRef idx="minor"/>
-                      </wps:style>
-                      <wps:bodyPr/>
-                    </wps:wsp>
-                  </a:graphicData>
-                </a:graphic>
-                <wp14:sizeRelH relativeFrom="page">
-                  <wp14:pctWidth>100000</wp14:pctWidth>
-                </wp14:sizeRelH>
-              </wp:inline>
+              <ns3:inline distT="0" distB="0" distL="0" distR="0">
+                <ns3:extent cx="5760720" cy="19050"/>
+                <ns3:effectExtent l="0" t="0" r="0" b="0"/>
+                <ns3:docPr id="12" name="Shape12"/>
+                <ns4:graphic>
+                  <ns4:graphicData uri="http://schemas.microsoft.com/office/word/2010/wordprocessingShape">
+                    <ns6:wsp>
+                      <ns6:cNvSpPr/>
+                      <ns6:spPr>
+                        <ns4:xfrm>
+                          <ns4:off x="0" y="0"/>
+                          <ns4:ext cx="5760720" cy="19080"/>
+                        </ns4:xfrm>
+                        <ns4:prstGeom prst="rect">
+                          <ns4:avLst/>
+                        </ns4:prstGeom>
+                        <ns4:solidFill>
+                          <ns4:srgbClr val="FFFFFF"/>
+                        </ns4:solidFill>
+                        <ns4:ln w="0">
+                          <ns4:solidFill>
+                            <ns4:srgbClr val="000000"/>
+                          </ns4:solidFill>
+                        </ns4:ln>
+                      </ns6:spPr>
+                      <ns6:style>
+                        <ns4:lnRef idx="0"/>
+                        <ns4:fillRef idx="0"/>
+                        <ns4:effectRef idx="0"/>
+                        <ns4:fontRef idx="minor"/>
+                      </ns6:style>
+                      <ns6:bodyPr/>
+                    </ns6:wsp>
+                  </ns4:graphicData>
+                </ns4:graphic>
+                <ns7:sizeRelH relativeFrom="page">
+                  <ns7:pctWidth>100000</ns7:pctWidth>
+                </ns7:sizeRelH>
+              </ns3:inline>
             </w:drawing>
-          </mc:Choice>
-          <mc:Fallback>
+          </ns1:Choice>
+          <ns1:Fallback>
             <w:pict>
-              <v:rect id="shape_0" fillcolor="white" stroked="t" o:allowincell="f" style="position:absolute;margin-left:0pt;margin-top:-1.55pt;width:453.55pt;height:1.45pt;mso-wrap-style:none;v-text-anchor:middle;mso-position-vertical:top">
-                <v:fill o:detectmouseclick="t" type="solid" color2="black"/>
-                <v:stroke color="black" joinstyle="round" endcap="flat"/>
-                <w10:wrap type="square"/>
-              </v:rect>
+              <ns8:rect id="shape_0" fillcolor="white" stroked="t" ns9:allowincell="f" style="position:absolute;margin-left:0pt;margin-top:-1.55pt;width:453.55pt;height:1.45pt;mso-wrap-style:none;v-text-anchor:middle;mso-position-vertical:top">
+                <ns8:fill ns9:detectmouseclick="t" type="solid" color2="black"/>
+                <ns8:stroke color="black" joinstyle="round" endcap="flat"/>
+                <ns10:wrap type="square"/>
+              </ns8:rect>
             </w:pict>
-          </mc:Fallback>
-        </mc:AlternateContent>
+          </ns1:Fallback>
+        </ns1:AlternateContent>
       </w:r>
       <w:bookmarkEnd w:id="11"/>
     </w:p>
@@ -5477,60 +5497,60 @@
       </w:pPr>
       <w:r>
         <w:rPr/>
-        <mc:AlternateContent>
-          <mc:Choice Requires="wps">
+        <ns1:AlternateContent>
+          <ns1:Choice Requires="wps">
             <w:drawing>
-              <wp:inline distT="0" distB="0" distL="0" distR="0">
-                <wp:extent cx="5760720" cy="19050"/>
-                <wp:effectExtent l="0" t="0" r="0" b="0"/>
-                <wp:docPr id="13" name="Shape13"/>
-                <a:graphic xmlns:a="http://schemas.openxmlformats.org/drawingml/2006/main">
-                  <a:graphicData uri="http://schemas.microsoft.com/office/word/2010/wordprocessingShape">
-                    <wps:wsp>
-                      <wps:cNvSpPr/>
-                      <wps:spPr>
-                        <a:xfrm>
-                          <a:off x="0" y="0"/>
-                          <a:ext cx="5760720" cy="19080"/>
-                        </a:xfrm>
-                        <a:prstGeom prst="rect">
-                          <a:avLst/>
-                        </a:prstGeom>
-                        <a:solidFill>
-                          <a:srgbClr val="FFFFFF"/>
-                        </a:solidFill>
-                        <a:ln w="0">
-                          <a:solidFill>
-                            <a:srgbClr val="000000"/>
-                          </a:solidFill>
-                        </a:ln>
-                      </wps:spPr>
-                      <wps:style>
-                        <a:lnRef idx="0"/>
-                        <a:fillRef idx="0"/>
-                        <a:effectRef idx="0"/>
-                        <a:fontRef idx="minor"/>
-                      </wps:style>
-                      <wps:bodyPr/>
-                    </wps:wsp>
-                  </a:graphicData>
-                </a:graphic>
-                <wp14:sizeRelH relativeFrom="page">
-                  <wp14:pctWidth>100000</wp14:pctWidth>
-                </wp14:sizeRelH>
-              </wp:inline>
+              <ns3:inline distT="0" distB="0" distL="0" distR="0">
+                <ns3:extent cx="5760720" cy="19050"/>
+                <ns3:effectExtent l="0" t="0" r="0" b="0"/>
+                <ns3:docPr id="13" name="Shape13"/>
+                <ns4:graphic>
+                  <ns4:graphicData uri="http://schemas.microsoft.com/office/word/2010/wordprocessingShape">
+                    <ns6:wsp>
+                      <ns6:cNvSpPr/>
+                      <ns6:spPr>
+                        <ns4:xfrm>
+                          <ns4:off x="0" y="0"/>
+                          <ns4:ext cx="5760720" cy="19080"/>
+                        </ns4:xfrm>
+                        <ns4:prstGeom prst="rect">
+                          <ns4:avLst/>
+                        </ns4:prstGeom>
+                        <ns4:solidFill>
+                          <ns4:srgbClr val="FFFFFF"/>
+                        </ns4:solidFill>
+                        <ns4:ln w="0">
+                          <ns4:solidFill>
+                            <ns4:srgbClr val="000000"/>
+                          </ns4:solidFill>
+                        </ns4:ln>
+                      </ns6:spPr>
+                      <ns6:style>
+                        <ns4:lnRef idx="0"/>
+                        <ns4:fillRef idx="0"/>
+                        <ns4:effectRef idx="0"/>
+                        <ns4:fontRef idx="minor"/>
+                      </ns6:style>
+                      <ns6:bodyPr/>
+                    </ns6:wsp>
+                  </ns4:graphicData>
+                </ns4:graphic>
+                <ns7:sizeRelH relativeFrom="page">
+                  <ns7:pctWidth>100000</ns7:pctWidth>
+                </ns7:sizeRelH>
+              </ns3:inline>
             </w:drawing>
-          </mc:Choice>
-          <mc:Fallback>
+          </ns1:Choice>
+          <ns1:Fallback>
             <w:pict>
-              <v:rect id="shape_0" fillcolor="white" stroked="t" o:allowincell="f" style="position:absolute;margin-left:0pt;margin-top:-1.55pt;width:453.55pt;height:1.45pt;mso-wrap-style:none;v-text-anchor:middle;mso-position-vertical:top">
-                <v:fill o:detectmouseclick="t" type="solid" color2="black"/>
-                <v:stroke color="black" joinstyle="round" endcap="flat"/>
-                <w10:wrap type="square"/>
-              </v:rect>
+              <ns8:rect id="shape_0" fillcolor="white" stroked="t" ns9:allowincell="f" style="position:absolute;margin-left:0pt;margin-top:-1.55pt;width:453.55pt;height:1.45pt;mso-wrap-style:none;v-text-anchor:middle;mso-position-vertical:top">
+                <ns8:fill ns9:detectmouseclick="t" type="solid" color2="black"/>
+                <ns8:stroke color="black" joinstyle="round" endcap="flat"/>
+                <ns10:wrap type="square"/>
+              </ns8:rect>
             </w:pict>
-          </mc:Fallback>
-        </mc:AlternateContent>
+          </ns1:Fallback>
+        </ns1:AlternateContent>
       </w:r>
       <w:bookmarkEnd w:id="12"/>
     </w:p>
@@ -10325,60 +10345,60 @@
       </w:pPr>
       <w:r>
         <w:rPr/>
-        <mc:AlternateContent>
-          <mc:Choice Requires="wps">
+        <ns1:AlternateContent>
+          <ns1:Choice Requires="wps">
             <w:drawing>
-              <wp:inline distT="0" distB="0" distL="0" distR="0">
-                <wp:extent cx="5760720" cy="19050"/>
-                <wp:effectExtent l="0" t="0" r="0" b="0"/>
-                <wp:docPr id="14" name="Shape14"/>
-                <a:graphic xmlns:a="http://schemas.openxmlformats.org/drawingml/2006/main">
-                  <a:graphicData uri="http://schemas.microsoft.com/office/word/2010/wordprocessingShape">
-                    <wps:wsp>
-                      <wps:cNvSpPr/>
-                      <wps:spPr>
-                        <a:xfrm>
-                          <a:off x="0" y="0"/>
-                          <a:ext cx="5760720" cy="19080"/>
-                        </a:xfrm>
-                        <a:prstGeom prst="rect">
-                          <a:avLst/>
-                        </a:prstGeom>
-                        <a:solidFill>
-                          <a:srgbClr val="FFFFFF"/>
-                        </a:solidFill>
-                        <a:ln w="0">
-                          <a:solidFill>
-                            <a:srgbClr val="000000"/>
-                          </a:solidFill>
-                        </a:ln>
-                      </wps:spPr>
-                      <wps:style>
-                        <a:lnRef idx="0"/>
-                        <a:fillRef idx="0"/>
-                        <a:effectRef idx="0"/>
-                        <a:fontRef idx="minor"/>
-                      </wps:style>
-                      <wps:bodyPr/>
-                    </wps:wsp>
-                  </a:graphicData>
-                </a:graphic>
-                <wp14:sizeRelH relativeFrom="page">
-                  <wp14:pctWidth>100000</wp14:pctWidth>
-                </wp14:sizeRelH>
-              </wp:inline>
+              <ns3:inline distT="0" distB="0" distL="0" distR="0">
+                <ns3:extent cx="5760720" cy="19050"/>
+                <ns3:effectExtent l="0" t="0" r="0" b="0"/>
+                <ns3:docPr id="14" name="Shape14"/>
+                <ns4:graphic>
+                  <ns4:graphicData uri="http://schemas.microsoft.com/office/word/2010/wordprocessingShape">
+                    <ns6:wsp>
+                      <ns6:cNvSpPr/>
+                      <ns6:spPr>
+                        <ns4:xfrm>
+                          <ns4:off x="0" y="0"/>
+                          <ns4:ext cx="5760720" cy="19080"/>
+                        </ns4:xfrm>
+                        <ns4:prstGeom prst="rect">
+                          <ns4:avLst/>
+                        </ns4:prstGeom>
+                        <ns4:solidFill>
+                          <ns4:srgbClr val="FFFFFF"/>
+                        </ns4:solidFill>
+                        <ns4:ln w="0">
+                          <ns4:solidFill>
+                            <ns4:srgbClr val="000000"/>
+                          </ns4:solidFill>
+                        </ns4:ln>
+                      </ns6:spPr>
+                      <ns6:style>
+                        <ns4:lnRef idx="0"/>
+                        <ns4:fillRef idx="0"/>
+                        <ns4:effectRef idx="0"/>
+                        <ns4:fontRef idx="minor"/>
+                      </ns6:style>
+                      <ns6:bodyPr/>
+                    </ns6:wsp>
+                  </ns4:graphicData>
+                </ns4:graphic>
+                <ns7:sizeRelH relativeFrom="page">
+                  <ns7:pctWidth>100000</ns7:pctWidth>
+                </ns7:sizeRelH>
+              </ns3:inline>
             </w:drawing>
-          </mc:Choice>
-          <mc:Fallback>
+          </ns1:Choice>
+          <ns1:Fallback>
             <w:pict>
-              <v:rect id="shape_0" fillcolor="white" stroked="t" o:allowincell="f" style="position:absolute;margin-left:0pt;margin-top:-1.55pt;width:453.55pt;height:1.45pt;mso-wrap-style:none;v-text-anchor:middle;mso-position-vertical:top">
-                <v:fill o:detectmouseclick="t" type="solid" color2="black"/>
-                <v:stroke color="black" joinstyle="round" endcap="flat"/>
-                <w10:wrap type="square"/>
-              </v:rect>
+              <ns8:rect id="shape_0" fillcolor="white" stroked="t" ns9:allowincell="f" style="position:absolute;margin-left:0pt;margin-top:-1.55pt;width:453.55pt;height:1.45pt;mso-wrap-style:none;v-text-anchor:middle;mso-position-vertical:top">
+                <ns8:fill ns9:detectmouseclick="t" type="solid" color2="black"/>
+                <ns8:stroke color="black" joinstyle="round" endcap="flat"/>
+                <ns10:wrap type="square"/>
+              </ns8:rect>
             </w:pict>
-          </mc:Fallback>
-        </mc:AlternateContent>
+          </ns1:Fallback>
+        </ns1:AlternateContent>
       </w:r>
       <w:bookmarkEnd w:id="13"/>
     </w:p>
@@ -10985,60 +11005,60 @@
       </w:pPr>
       <w:r>
         <w:rPr/>
-        <mc:AlternateContent>
-          <mc:Choice Requires="wps">
+        <ns1:AlternateContent>
+          <ns1:Choice Requires="wps">
             <w:drawing>
-              <wp:inline distT="0" distB="0" distL="0" distR="0">
-                <wp:extent cx="5760720" cy="19050"/>
-                <wp:effectExtent l="0" t="0" r="0" b="0"/>
-                <wp:docPr id="15" name="Shape15"/>
-                <a:graphic xmlns:a="http://schemas.openxmlformats.org/drawingml/2006/main">
-                  <a:graphicData uri="http://schemas.microsoft.com/office/word/2010/wordprocessingShape">
-                    <wps:wsp>
-                      <wps:cNvSpPr/>
-                      <wps:spPr>
-                        <a:xfrm>
-                          <a:off x="0" y="0"/>
-                          <a:ext cx="5760720" cy="19080"/>
-                        </a:xfrm>
-                        <a:prstGeom prst="rect">
-                          <a:avLst/>
-                        </a:prstGeom>
-                        <a:solidFill>
-                          <a:srgbClr val="FFFFFF"/>
-                        </a:solidFill>
-                        <a:ln w="0">
-                          <a:solidFill>
-                            <a:srgbClr val="000000"/>
-                          </a:solidFill>
-                        </a:ln>
-                      </wps:spPr>
-                      <wps:style>
-                        <a:lnRef idx="0"/>
-                        <a:fillRef idx="0"/>
-                        <a:effectRef idx="0"/>
-                        <a:fontRef idx="minor"/>
-                      </wps:style>
-                      <wps:bodyPr/>
-                    </wps:wsp>
-                  </a:graphicData>
-                </a:graphic>
-                <wp14:sizeRelH relativeFrom="page">
-                  <wp14:pctWidth>100000</wp14:pctWidth>
-                </wp14:sizeRelH>
-              </wp:inline>
+              <ns3:inline distT="0" distB="0" distL="0" distR="0">
+                <ns3:extent cx="5760720" cy="19050"/>
+                <ns3:effectExtent l="0" t="0" r="0" b="0"/>
+                <ns3:docPr id="15" name="Shape15"/>
+                <ns4:graphic>
+                  <ns4:graphicData uri="http://schemas.microsoft.com/office/word/2010/wordprocessingShape">
+                    <ns6:wsp>
+                      <ns6:cNvSpPr/>
+                      <ns6:spPr>
+                        <ns4:xfrm>
+                          <ns4:off x="0" y="0"/>
+                          <ns4:ext cx="5760720" cy="19080"/>
+                        </ns4:xfrm>
+                        <ns4:prstGeom prst="rect">
+                          <ns4:avLst/>
+                        </ns4:prstGeom>
+                        <ns4:solidFill>
+                          <ns4:srgbClr val="FFFFFF"/>
+                        </ns4:solidFill>
+                        <ns4:ln w="0">
+                          <ns4:solidFill>
+                            <ns4:srgbClr val="000000"/>
+                          </ns4:solidFill>
+                        </ns4:ln>
+                      </ns6:spPr>
+                      <ns6:style>
+                        <ns4:lnRef idx="0"/>
+                        <ns4:fillRef idx="0"/>
+                        <ns4:effectRef idx="0"/>
+                        <ns4:fontRef idx="minor"/>
+                      </ns6:style>
+                      <ns6:bodyPr/>
+                    </ns6:wsp>
+                  </ns4:graphicData>
+                </ns4:graphic>
+                <ns7:sizeRelH relativeFrom="page">
+                  <ns7:pctWidth>100000</ns7:pctWidth>
+                </ns7:sizeRelH>
+              </ns3:inline>
             </w:drawing>
-          </mc:Choice>
-          <mc:Fallback>
+          </ns1:Choice>
+          <ns1:Fallback>
             <w:pict>
-              <v:rect id="shape_0" fillcolor="white" stroked="t" o:allowincell="f" style="position:absolute;margin-left:0pt;margin-top:-1.55pt;width:453.55pt;height:1.45pt;mso-wrap-style:none;v-text-anchor:middle;mso-position-vertical:top">
-                <v:fill o:detectmouseclick="t" type="solid" color2="black"/>
-                <v:stroke color="black" joinstyle="round" endcap="flat"/>
-                <w10:wrap type="square"/>
-              </v:rect>
+              <ns8:rect id="shape_0" fillcolor="white" stroked="t" ns9:allowincell="f" style="position:absolute;margin-left:0pt;margin-top:-1.55pt;width:453.55pt;height:1.45pt;mso-wrap-style:none;v-text-anchor:middle;mso-position-vertical:top">
+                <ns8:fill ns9:detectmouseclick="t" type="solid" color2="black"/>
+                <ns8:stroke color="black" joinstyle="round" endcap="flat"/>
+                <ns10:wrap type="square"/>
+              </ns8:rect>
             </w:pict>
-          </mc:Fallback>
-        </mc:AlternateContent>
+          </ns1:Fallback>
+        </ns1:AlternateContent>
       </w:r>
     </w:p>
     <w:p>
@@ -11054,42 +11074,42 @@
             <w:rStyle w:val="Hyperlink"/>
           </w:rPr>
           <w:drawing>
-            <wp:inline distT="0" distB="0" distL="0" distR="0">
-              <wp:extent cx="914400" cy="235585"/>
-              <wp:effectExtent l="0" t="0" r="0" b="0"/>
-              <wp:docPr id="16" name="Picture" descr="Instats"/>
-              <wp:cNvGraphicFramePr>
-                <a:graphicFrameLocks xmlns:a="http://schemas.openxmlformats.org/drawingml/2006/main" noChangeAspect="1"/>
-              </wp:cNvGraphicFramePr>
-              <a:graphic xmlns:a="http://schemas.openxmlformats.org/drawingml/2006/main">
-                <a:graphicData uri="http://schemas.openxmlformats.org/drawingml/2006/picture">
-                  <pic:pic xmlns:pic="http://schemas.openxmlformats.org/drawingml/2006/picture">
-                    <pic:nvPicPr>
-                      <pic:cNvPr id="16" name="Picture" descr="Instats"/>
-                      <pic:cNvPicPr>
-                        <a:picLocks noChangeAspect="1" noChangeArrowheads="1"/>
-                      </pic:cNvPicPr>
-                    </pic:nvPicPr>
-                    <pic:blipFill>
-                      <a:blip r:embed="rId4"/>
-                      <a:stretch>
-                        <a:fillRect/>
-                      </a:stretch>
-                    </pic:blipFill>
-                    <pic:spPr bwMode="auto">
-                      <a:xfrm>
-                        <a:off x="0" y="0"/>
-                        <a:ext cx="914400" cy="235585"/>
-                      </a:xfrm>
-                      <a:prstGeom prst="rect">
-                        <a:avLst/>
-                      </a:prstGeom>
-                      <a:noFill/>
-                    </pic:spPr>
-                  </pic:pic>
-                </a:graphicData>
-              </a:graphic>
-            </wp:inline>
+            <ns3:inline distT="0" distB="0" distL="0" distR="0">
+              <ns3:extent cx="914400" cy="235585"/>
+              <ns3:effectExtent l="0" t="0" r="0" b="0"/>
+              <ns3:docPr id="16" name="Picture" descr="Instats"/>
+              <ns3:cNvGraphicFramePr>
+                <ns4:graphicFrameLocks noChangeAspect="1"/>
+              </ns3:cNvGraphicFramePr>
+              <ns4:graphic>
+                <ns4:graphicData uri="http://schemas.openxmlformats.org/drawingml/2006/picture">
+                  <ns5:pic>
+                    <ns5:nvPicPr>
+                      <ns5:cNvPr id="16" name="Picture" descr="Instats"/>
+                      <ns5:cNvPicPr>
+                        <ns4:picLocks noChangeAspect="1" noChangeArrowheads="1"/>
+                      </ns5:cNvPicPr>
+                    </ns5:nvPicPr>
+                    <ns5:blipFill>
+                      <ns4:blip r:embed="rId4"/>
+                      <ns4:stretch>
+                        <ns4:fillRect/>
+                      </ns4:stretch>
+                    </ns5:blipFill>
+                    <ns5:spPr bwMode="auto">
+                      <ns4:xfrm>
+                        <ns4:off x="0" y="0"/>
+                        <ns4:ext cx="914400" cy="235585"/>
+                      </ns4:xfrm>
+                      <ns4:prstGeom prst="rect">
+                        <ns4:avLst/>
+                      </ns4:prstGeom>
+                      <ns4:noFill/>
+                    </ns5:spPr>
+                  </ns5:pic>
+                </ns4:graphicData>
+              </ns4:graphic>
+            </ns3:inline>
           </w:drawing>
         </w:r>
       </w:hyperlink>
@@ -11146,41 +11166,130 @@
       </w:pPr>
       <w:r>
         <w:rPr>
-          <w:i/>
-          <w:iCs/>
-        </w:rPr>
-        <w:t xml:space="preserve">Part of the Instats AI Readiness Pack · </w:t>
-      </w:r>
-      <w:hyperlink r:id="rId7">
+          <w:b/>
+          <w:i w:val="0"/>
+        </w:rPr>
+        <w:t xml:space="preserve">Cite the pack. </w:t>
+      </w:r>
+      <w:r>
+        <w:rPr>
+          <w:i w:val="0"/>
+        </w:rPr>
+        <w:t xml:space="preserve">Zyphur, M. J. (2026). </w:t>
+      </w:r>
+      <w:hyperlink r:id="rId20">
         <w:r>
           <w:rPr>
             <w:rStyle w:val="Hyperlink"/>
-            <w:i/>
-            <w:iCs/>
+            <w:i w:val="1"/>
           </w:rPr>
-          <w:t>instats.org/publications/ai-readiness</w:t>
+          <w:t xml:space="preserve">The Institutional AI Readiness Pack: Self-Assessment and Implementation Tools for Responsible AI in Academic Research</w:t>
         </w:r>
       </w:hyperlink>
       <w:r>
         <w:rPr>
-          <w:i/>
-          <w:iCs/>
-        </w:rPr>
-        <w:t xml:space="preserve"> · CC BY 4.0 — adapt freely for institutional use, with attribution. Companion to</w:t>
-      </w:r>
-      <w:r>
-        <w:rPr/>
-        <w:t xml:space="preserve"> Responsible AI in Academic Research: A Competency Framework for Research Training </w:t>
-      </w:r>
-      <w:r>
-        <w:rPr>
-          <w:i/>
-          <w:iCs/>
-        </w:rPr>
-        <w:t>(DOI 10.61700/t31oy23grr).</w:t>
-      </w:r>
-      <w:bookmarkEnd w:id="0"/>
-      <w:bookmarkEnd w:id="14"/>
+          <w:i w:val="0"/>
+        </w:rPr>
+        <w:t xml:space="preserve">. Instats Policy Series. </w:t>
+      </w:r>
+      <w:hyperlink r:id="rId21">
+        <w:r>
+          <w:rPr>
+            <w:rStyle w:val="Hyperlink"/>
+            <w:i w:val="0"/>
+          </w:rPr>
+          <w:t xml:space="preserve">https://doi.org/10.61700/bv2nulyhht</w:t>
+        </w:r>
+      </w:hyperlink>
+    </w:p>
+    <w:p>
+      <w:pPr>
+        <w:pStyle w:val="InstatsColophon"/>
+        <w:keepLines/>
+        <w:pBdr>
+          <w:left w:val="single" w:sz="24" w:space="10" w:color="3092B1"/>
+        </w:pBdr>
+        <w:spacing w:lineRule="auto" w:line="336" w:before="80" w:after="160"/>
+        <w:ind w:start="283"/>
+        <w:rPr/>
+      </w:pPr>
+      <w:r>
+        <w:rPr>
+          <w:b/>
+          <w:i w:val="0"/>
+        </w:rPr>
+        <w:t xml:space="preserve">Companion report. </w:t>
+      </w:r>
+      <w:r>
+        <w:rPr>
+          <w:i w:val="0"/>
+        </w:rPr>
+        <w:t xml:space="preserve">Zyphur, M. J. (2026). </w:t>
+      </w:r>
+      <w:hyperlink r:id="rId22">
+        <w:r>
+          <w:rPr>
+            <w:rStyle w:val="Hyperlink"/>
+            <w:i w:val="1"/>
+          </w:rPr>
+          <w:t xml:space="preserve">Responsible AI in Academic Research: A Competency Framework for Research Training</w:t>
+        </w:r>
+      </w:hyperlink>
+      <w:r>
+        <w:rPr>
+          <w:i w:val="0"/>
+        </w:rPr>
+        <w:t xml:space="preserve">. Instats Policy Series. </w:t>
+      </w:r>
+      <w:hyperlink r:id="rId23">
+        <w:r>
+          <w:rPr>
+            <w:rStyle w:val="Hyperlink"/>
+            <w:i w:val="0"/>
+          </w:rPr>
+          <w:t xml:space="preserve">https://doi.org/10.61700/t31oy23grr</w:t>
+        </w:r>
+      </w:hyperlink>
+    </w:p>
+    <w:p>
+      <w:pPr>
+        <w:pStyle w:val="InstatsColophon"/>
+        <w:keepLines/>
+        <w:pBdr>
+          <w:left w:val="single" w:sz="24" w:space="10" w:color="3092B1"/>
+        </w:pBdr>
+        <w:spacing w:lineRule="auto" w:line="336" w:before="80" w:after="160"/>
+        <w:ind w:start="283"/>
+        <w:rPr/>
+      </w:pPr>
+      <w:r>
+        <w:rPr>
+          <w:b/>
+          <w:i w:val="0"/>
+        </w:rPr>
+        <w:t xml:space="preserve">License. </w:t>
+      </w:r>
+      <w:r>
+        <w:rPr>
+          <w:i w:val="0"/>
+        </w:rPr>
+        <w:t xml:space="preserve">The pack and its instruments are licensed under </w:t>
+      </w:r>
+      <w:hyperlink r:id="rId24">
+        <w:r>
+          <w:rPr>
+            <w:rStyle w:val="Hyperlink"/>
+            <w:i w:val="0"/>
+          </w:rPr>
+          <w:t xml:space="preserve">Creative Commons Attribution 4.0 International (CC BY 4.0)</w:t>
+        </w:r>
+      </w:hyperlink>
+      <w:r>
+        <w:rPr>
+          <w:i w:val="0"/>
+        </w:rPr>
+        <w:t xml:space="preserve">. You may adapt them for institutional use with attribution.</w:t>
+      </w:r>
     </w:p>
     <w:sectPr>
       <w:headerReference w:type="even" r:id="rId8"/>

</xml_diff>

<commit_message>
Publish Mac-compatible Word packages and trim public pack
</commit_message>
<xml_diff>
--- a/docs/instruments/a3_supervisor_survey.docx
+++ b/docs/instruments/a3_supervisor_survey.docx
@@ -1,49 +1,49 @@
 
 <file path=word/document.xml><?xml version="1.0" encoding="utf-8"?>
-<w:document xmlns:ns1="http://schemas.openxmlformats.org/markup-compatibility/2006" xmlns:ns10="urn:schemas-microsoft-com:office:word" xmlns:ns3="http://schemas.openxmlformats.org/drawingml/2006/wordprocessingDrawing" xmlns:ns4="http://schemas.openxmlformats.org/drawingml/2006/main" xmlns:ns5="http://schemas.openxmlformats.org/drawingml/2006/picture" xmlns:ns6="http://schemas.microsoft.com/office/word/2010/wordprocessingShape" xmlns:ns7="http://schemas.microsoft.com/office/word/2010/wordprocessingDrawing" xmlns:ns8="urn:schemas-microsoft-com:vml" xmlns:ns9="urn:schemas-microsoft-com:office:office" xmlns:r="http://schemas.openxmlformats.org/officeDocument/2006/relationships" xmlns:w="http://schemas.openxmlformats.org/wordprocessingml/2006/main" ns1:Ignorable="w14 wp14 w15">
+<w:document xmlns:o="urn:schemas-microsoft-com:office:office" xmlns:r="http://schemas.openxmlformats.org/officeDocument/2006/relationships" xmlns:v="urn:schemas-microsoft-com:vml" xmlns:w="http://schemas.openxmlformats.org/wordprocessingml/2006/main" xmlns:w10="urn:schemas-microsoft-com:office:word" xmlns:wp="http://schemas.openxmlformats.org/drawingml/2006/wordprocessingDrawing" xmlns:pic="http://schemas.openxmlformats.org/drawingml/2006/picture" xmlns:wps="http://schemas.microsoft.com/office/word/2010/wordprocessingShape" xmlns:wpg="http://schemas.microsoft.com/office/word/2010/wordprocessingGroup" xmlns:mc="http://schemas.openxmlformats.org/markup-compatibility/2006" xmlns:wp14="http://schemas.microsoft.com/office/word/2010/wordprocessingDrawing" xmlns:w14="http://schemas.microsoft.com/office/word/2010/wordml" xmlns:w15="http://schemas.microsoft.com/office/word/2012/wordml" mc:Ignorable="w14 wp14 w15">
   <w:body>
     <w:p>
-      <w:hyperlink r:id="rId19">
+      <w:hyperlink r:id="rId24">
         <w:r>
           <w:drawing>
-            <ns3:inline>
-              <ns3:extent cx="1325880" cy="341661"/>
-              <ns3:effectExtent b="0" l="0" r="0" t="0"/>
-              <ns3:docPr descr="Instats" title="" id="22" name="Picture"/>
-              <ns4:graphic>
-                <ns4:graphicData uri="http://schemas.openxmlformats.org/drawingml/2006/picture">
-                  <ns5:pic>
-                    <ns5:nvPicPr>
-                      <ns5:cNvPr descr="instats_logo.png" id="23" name="Picture"/>
-                      <ns5:cNvPicPr>
-                        <ns4:picLocks noChangeArrowheads="1" noChangeAspect="1"/>
-                      </ns5:cNvPicPr>
-                    </ns5:nvPicPr>
-                    <ns5:blipFill>
-                      <ns4:blip r:embed="rId18"/>
-                      <ns4:stretch>
-                        <ns4:fillRect/>
-                      </ns4:stretch>
-                    </ns5:blipFill>
-                    <ns5:spPr bwMode="auto">
-                      <ns4:xfrm>
-                        <ns4:off x="0" y="0"/>
-                        <ns4:ext cx="1325880" cy="341661"/>
-                      </ns4:xfrm>
-                      <ns4:prstGeom prst="rect">
-                        <ns4:avLst/>
-                      </ns4:prstGeom>
-                      <ns4:noFill/>
-                      <ns4:ln w="9525">
-                        <ns4:noFill/>
-                        <ns4:headEnd/>
-                        <ns4:tailEnd/>
-                      </ns4:ln>
-                    </ns5:spPr>
-                  </ns5:pic>
-                </ns4:graphicData>
-              </ns4:graphic>
-            </ns3:inline>
+            <wp:inline>
+              <wp:extent cx="1325880" cy="341661"/>
+              <wp:effectExtent b="0" l="0" r="0" t="0"/>
+              <wp:docPr descr="Instats" title="" id="22" name="Picture"/>
+              <a:graphic xmlns:a="http://schemas.openxmlformats.org/drawingml/2006/main">
+                <a:graphicData uri="http://schemas.openxmlformats.org/drawingml/2006/picture">
+                  <pic:pic>
+                    <pic:nvPicPr>
+                      <pic:cNvPr descr="instats_logo.png" id="23" name="Picture"/>
+                      <pic:cNvPicPr>
+                        <a:picLocks noChangeArrowheads="1" noChangeAspect="1"/>
+                      </pic:cNvPicPr>
+                    </pic:nvPicPr>
+                    <pic:blipFill>
+                      <a:blip r:embed="rId23"/>
+                      <a:stretch>
+                        <a:fillRect/>
+                      </a:stretch>
+                    </pic:blipFill>
+                    <pic:spPr bwMode="auto">
+                      <a:xfrm>
+                        <a:off x="0" y="0"/>
+                        <a:ext cx="1325880" cy="341661"/>
+                      </a:xfrm>
+                      <a:prstGeom prst="rect">
+                        <a:avLst/>
+                      </a:prstGeom>
+                      <a:noFill/>
+                      <a:ln w="9525">
+                        <a:noFill/>
+                        <a:headEnd/>
+                        <a:tailEnd/>
+                      </a:ln>
+                    </pic:spPr>
+                  </pic:pic>
+                </a:graphicData>
+              </a:graphic>
+            </wp:inline>
           </w:drawing>
         </w:r>
       </w:hyperlink>
@@ -79,79 +79,77 @@
       </w:pPr>
       <w:r>
         <w:rPr/>
-        <ns1:AlternateContent>
-          <ns1:Choice Requires="wps">
+        <mc:AlternateContent>
+          <mc:Choice Requires="wps">
             <w:drawing>
-              <ns3:inline distT="0" distB="0" distL="0" distR="0">
-                <ns3:extent cx="5760720" cy="19050"/>
-                <ns3:effectExtent l="0" t="0" r="0" b="0"/>
-                <ns3:docPr id="1" name="Shape1"/>
-                <ns4:graphic>
-                  <ns4:graphicData uri="http://schemas.microsoft.com/office/word/2010/wordprocessingShape">
-                    <ns6:wsp>
-                      <ns6:cNvSpPr/>
-                      <ns6:spPr>
-                        <ns4:xfrm>
-                          <ns4:off x="0" y="0"/>
-                          <ns4:ext cx="5760720" cy="19080"/>
-                        </ns4:xfrm>
-                        <ns4:prstGeom prst="rect">
-                          <ns4:avLst/>
-                        </ns4:prstGeom>
-                        <ns4:solidFill>
-                          <ns4:srgbClr val="FFFFFF"/>
-                        </ns4:solidFill>
-                        <ns4:ln w="0">
-                          <ns4:solidFill>
-                            <ns4:srgbClr val="000000"/>
-                          </ns4:solidFill>
-                        </ns4:ln>
-                      </ns6:spPr>
-                      <ns6:style>
-                        <ns4:lnRef idx="0"/>
-                        <ns4:fillRef idx="0"/>
-                        <ns4:effectRef idx="0"/>
-                        <ns4:fontRef idx="minor"/>
-                      </ns6:style>
-                      <ns6:bodyPr/>
-                    </ns6:wsp>
-                  </ns4:graphicData>
-                </ns4:graphic>
-                <ns7:sizeRelH relativeFrom="page">
-                  <ns7:pctWidth>100000</ns7:pctWidth>
-                </ns7:sizeRelH>
-              </ns3:inline>
+              <wp:inline distT="0" distB="0" distL="0" distR="0">
+                <wp:extent cx="5760720" cy="19050"/>
+                <wp:effectExtent l="0" t="0" r="0" b="0"/>
+                <wp:docPr id="1" name="Shape1"/>
+                <a:graphic xmlns:a="http://schemas.openxmlformats.org/drawingml/2006/main">
+                  <a:graphicData uri="http://schemas.microsoft.com/office/word/2010/wordprocessingShape">
+                    <wps:wsp>
+                      <wps:cNvSpPr/>
+                      <wps:spPr>
+                        <a:xfrm>
+                          <a:off x="0" y="0"/>
+                          <a:ext cx="5760720" cy="19080"/>
+                        </a:xfrm>
+                        <a:prstGeom prst="rect">
+                          <a:avLst/>
+                        </a:prstGeom>
+                        <a:solidFill>
+                          <a:srgbClr val="FFFFFF"/>
+                        </a:solidFill>
+                        <a:ln w="0">
+                          <a:solidFill>
+                            <a:srgbClr val="000000"/>
+                          </a:solidFill>
+                        </a:ln>
+                      </wps:spPr>
+                      <wps:style>
+                        <a:lnRef idx="0"/>
+                        <a:fillRef idx="0"/>
+                        <a:effectRef idx="0"/>
+                        <a:fontRef idx="minor"/>
+                      </wps:style>
+                      <wps:bodyPr/>
+                    </wps:wsp>
+                  </a:graphicData>
+                </a:graphic>
+                <wp14:sizeRelH relativeFrom="page">
+                  <wp14:pctWidth>100000</wp14:pctWidth>
+                </wp14:sizeRelH>
+              </wp:inline>
             </w:drawing>
-          </ns1:Choice>
-          <ns1:Fallback>
+          </mc:Choice>
+          <mc:Fallback>
             <w:pict>
-              <ns8:rect id="shape_0" fillcolor="white" stroked="t" ns9:allowincell="f" style="position:absolute;margin-left:0pt;margin-top:-1.55pt;width:453.55pt;height:1.45pt;mso-wrap-style:none;v-text-anchor:middle;mso-position-vertical:top">
-                <ns8:fill ns9:detectmouseclick="t" type="solid" color2="black"/>
-                <ns8:stroke color="black" joinstyle="round" endcap="flat"/>
-                <ns10:wrap type="square"/>
-              </ns8:rect>
+              <v:rect id="shape_0" fillcolor="white" stroked="t" o:allowincell="f" style="position:absolute;margin-left:0pt;margin-top:-1.55pt;width:453.55pt;height:1.45pt;mso-wrap-style:none;v-text-anchor:middle;mso-position-vertical:top">
+                <v:fill o:detectmouseclick="t" type="solid" color2="black"/>
+                <v:stroke color="black" joinstyle="round" endcap="flat"/>
+                <w10:wrap type="square"/>
+              </v:rect>
             </w:pict>
-          </ns1:Fallback>
-        </ns1:AlternateContent>
+          </mc:Fallback>
+        </mc:AlternateContent>
       </w:r>
     </w:p>
     <w:p>
       <w:pPr>
-        <w:pStyle w:val="BodyText"/>
-      </w:pPr>
-      <w:hyperlink r:id="rId25">
+        <w:pStyle w:val="FirstParagraph"/>
+        <w:rPr/>
+      </w:pPr>
+      <w:hyperlink r:id="rId2">
         <w:r>
           <w:rPr>
             <w:rStyle w:val="Hyperlink"/>
-            <w:i w:val="0"/>
           </w:rPr>
-          <w:t xml:space="preserve">Browse the full online instrument catalogue</w:t>
+          <w:t>Browse the full online instrument catalogue</w:t>
         </w:r>
       </w:hyperlink>
       <w:r>
-        <w:rPr>
-          <w:i w:val="0"/>
-        </w:rPr>
+        <w:rPr/>
         <w:t xml:space="preserve"> to read or download every resource in HTML, Word, PDF, and spreadsheet formats.</w:t>
       </w:r>
     </w:p>
@@ -489,7 +487,7 @@
                 <w:lang w:val="en-US" w:eastAsia="en-US" w:bidi="ar-SA"/>
               </w:rPr>
             </w:pPr>
-            <w:hyperlink r:id="rId2">
+            <w:hyperlink r:id="rId3">
               <w:r>
                 <w:rPr>
                   <w:rStyle w:val="Hyperlink"/>
@@ -911,60 +909,60 @@
       </w:pPr>
       <w:r>
         <w:rPr/>
-        <ns1:AlternateContent>
-          <ns1:Choice Requires="wps">
+        <mc:AlternateContent>
+          <mc:Choice Requires="wps">
             <w:drawing>
-              <ns3:inline distT="0" distB="0" distL="0" distR="0">
-                <ns3:extent cx="5760720" cy="19050"/>
-                <ns3:effectExtent l="0" t="0" r="0" b="0"/>
-                <ns3:docPr id="2" name="Shape2"/>
-                <ns4:graphic>
-                  <ns4:graphicData uri="http://schemas.microsoft.com/office/word/2010/wordprocessingShape">
-                    <ns6:wsp>
-                      <ns6:cNvSpPr/>
-                      <ns6:spPr>
-                        <ns4:xfrm>
-                          <ns4:off x="0" y="0"/>
-                          <ns4:ext cx="5760720" cy="19080"/>
-                        </ns4:xfrm>
-                        <ns4:prstGeom prst="rect">
-                          <ns4:avLst/>
-                        </ns4:prstGeom>
-                        <ns4:solidFill>
-                          <ns4:srgbClr val="FFFFFF"/>
-                        </ns4:solidFill>
-                        <ns4:ln w="0">
-                          <ns4:solidFill>
-                            <ns4:srgbClr val="000000"/>
-                          </ns4:solidFill>
-                        </ns4:ln>
-                      </ns6:spPr>
-                      <ns6:style>
-                        <ns4:lnRef idx="0"/>
-                        <ns4:fillRef idx="0"/>
-                        <ns4:effectRef idx="0"/>
-                        <ns4:fontRef idx="minor"/>
-                      </ns6:style>
-                      <ns6:bodyPr/>
-                    </ns6:wsp>
-                  </ns4:graphicData>
-                </ns4:graphic>
-                <ns7:sizeRelH relativeFrom="page">
-                  <ns7:pctWidth>100000</ns7:pctWidth>
-                </ns7:sizeRelH>
-              </ns3:inline>
+              <wp:inline distT="0" distB="0" distL="0" distR="0">
+                <wp:extent cx="5760720" cy="19050"/>
+                <wp:effectExtent l="0" t="0" r="0" b="0"/>
+                <wp:docPr id="2" name="Shape2"/>
+                <a:graphic xmlns:a="http://schemas.openxmlformats.org/drawingml/2006/main">
+                  <a:graphicData uri="http://schemas.microsoft.com/office/word/2010/wordprocessingShape">
+                    <wps:wsp>
+                      <wps:cNvSpPr/>
+                      <wps:spPr>
+                        <a:xfrm>
+                          <a:off x="0" y="0"/>
+                          <a:ext cx="5760720" cy="19080"/>
+                        </a:xfrm>
+                        <a:prstGeom prst="rect">
+                          <a:avLst/>
+                        </a:prstGeom>
+                        <a:solidFill>
+                          <a:srgbClr val="FFFFFF"/>
+                        </a:solidFill>
+                        <a:ln w="0">
+                          <a:solidFill>
+                            <a:srgbClr val="000000"/>
+                          </a:solidFill>
+                        </a:ln>
+                      </wps:spPr>
+                      <wps:style>
+                        <a:lnRef idx="0"/>
+                        <a:fillRef idx="0"/>
+                        <a:effectRef idx="0"/>
+                        <a:fontRef idx="minor"/>
+                      </wps:style>
+                      <wps:bodyPr/>
+                    </wps:wsp>
+                  </a:graphicData>
+                </a:graphic>
+                <wp14:sizeRelH relativeFrom="page">
+                  <wp14:pctWidth>100000</wp14:pctWidth>
+                </wp14:sizeRelH>
+              </wp:inline>
             </w:drawing>
-          </ns1:Choice>
-          <ns1:Fallback>
+          </mc:Choice>
+          <mc:Fallback>
             <w:pict>
-              <ns8:rect id="shape_0" fillcolor="white" stroked="t" ns9:allowincell="f" style="position:absolute;margin-left:0pt;margin-top:-1.55pt;width:453.55pt;height:1.45pt;mso-wrap-style:none;v-text-anchor:middle;mso-position-vertical:top">
-                <ns8:fill ns9:detectmouseclick="t" type="solid" color2="black"/>
-                <ns8:stroke color="black" joinstyle="round" endcap="flat"/>
-                <ns10:wrap type="square"/>
-              </ns8:rect>
+              <v:rect id="shape_0" fillcolor="white" stroked="t" o:allowincell="f" style="position:absolute;margin-left:0pt;margin-top:-1.55pt;width:453.55pt;height:1.45pt;mso-wrap-style:none;v-text-anchor:middle;mso-position-vertical:top">
+                <v:fill o:detectmouseclick="t" type="solid" color2="black"/>
+                <v:stroke color="black" joinstyle="round" endcap="flat"/>
+                <w10:wrap type="square"/>
+              </v:rect>
             </w:pict>
-          </ns1:Fallback>
-        </ns1:AlternateContent>
+          </mc:Fallback>
+        </mc:AlternateContent>
       </w:r>
       <w:bookmarkEnd w:id="1"/>
     </w:p>
@@ -1722,60 +1720,60 @@
       </w:pPr>
       <w:r>
         <w:rPr/>
-        <ns1:AlternateContent>
-          <ns1:Choice Requires="wps">
+        <mc:AlternateContent>
+          <mc:Choice Requires="wps">
             <w:drawing>
-              <ns3:inline distT="0" distB="0" distL="0" distR="0">
-                <ns3:extent cx="5760720" cy="19050"/>
-                <ns3:effectExtent l="0" t="0" r="0" b="0"/>
-                <ns3:docPr id="3" name="Shape3"/>
-                <ns4:graphic>
-                  <ns4:graphicData uri="http://schemas.microsoft.com/office/word/2010/wordprocessingShape">
-                    <ns6:wsp>
-                      <ns6:cNvSpPr/>
-                      <ns6:spPr>
-                        <ns4:xfrm>
-                          <ns4:off x="0" y="0"/>
-                          <ns4:ext cx="5760720" cy="19080"/>
-                        </ns4:xfrm>
-                        <ns4:prstGeom prst="rect">
-                          <ns4:avLst/>
-                        </ns4:prstGeom>
-                        <ns4:solidFill>
-                          <ns4:srgbClr val="FFFFFF"/>
-                        </ns4:solidFill>
-                        <ns4:ln w="0">
-                          <ns4:solidFill>
-                            <ns4:srgbClr val="000000"/>
-                          </ns4:solidFill>
-                        </ns4:ln>
-                      </ns6:spPr>
-                      <ns6:style>
-                        <ns4:lnRef idx="0"/>
-                        <ns4:fillRef idx="0"/>
-                        <ns4:effectRef idx="0"/>
-                        <ns4:fontRef idx="minor"/>
-                      </ns6:style>
-                      <ns6:bodyPr/>
-                    </ns6:wsp>
-                  </ns4:graphicData>
-                </ns4:graphic>
-                <ns7:sizeRelH relativeFrom="page">
-                  <ns7:pctWidth>100000</ns7:pctWidth>
-                </ns7:sizeRelH>
-              </ns3:inline>
+              <wp:inline distT="0" distB="0" distL="0" distR="0">
+                <wp:extent cx="5760720" cy="19050"/>
+                <wp:effectExtent l="0" t="0" r="0" b="0"/>
+                <wp:docPr id="3" name="Shape3"/>
+                <a:graphic xmlns:a="http://schemas.openxmlformats.org/drawingml/2006/main">
+                  <a:graphicData uri="http://schemas.microsoft.com/office/word/2010/wordprocessingShape">
+                    <wps:wsp>
+                      <wps:cNvSpPr/>
+                      <wps:spPr>
+                        <a:xfrm>
+                          <a:off x="0" y="0"/>
+                          <a:ext cx="5760720" cy="19080"/>
+                        </a:xfrm>
+                        <a:prstGeom prst="rect">
+                          <a:avLst/>
+                        </a:prstGeom>
+                        <a:solidFill>
+                          <a:srgbClr val="FFFFFF"/>
+                        </a:solidFill>
+                        <a:ln w="0">
+                          <a:solidFill>
+                            <a:srgbClr val="000000"/>
+                          </a:solidFill>
+                        </a:ln>
+                      </wps:spPr>
+                      <wps:style>
+                        <a:lnRef idx="0"/>
+                        <a:fillRef idx="0"/>
+                        <a:effectRef idx="0"/>
+                        <a:fontRef idx="minor"/>
+                      </wps:style>
+                      <wps:bodyPr/>
+                    </wps:wsp>
+                  </a:graphicData>
+                </a:graphic>
+                <wp14:sizeRelH relativeFrom="page">
+                  <wp14:pctWidth>100000</wp14:pctWidth>
+                </wp14:sizeRelH>
+              </wp:inline>
             </w:drawing>
-          </ns1:Choice>
-          <ns1:Fallback>
+          </mc:Choice>
+          <mc:Fallback>
             <w:pict>
-              <ns8:rect id="shape_0" fillcolor="white" stroked="t" ns9:allowincell="f" style="position:absolute;margin-left:0pt;margin-top:-1.55pt;width:453.55pt;height:1.45pt;mso-wrap-style:none;v-text-anchor:middle;mso-position-vertical:top">
-                <ns8:fill ns9:detectmouseclick="t" type="solid" color2="black"/>
-                <ns8:stroke color="black" joinstyle="round" endcap="flat"/>
-                <ns10:wrap type="square"/>
-              </ns8:rect>
+              <v:rect id="shape_0" fillcolor="white" stroked="t" o:allowincell="f" style="position:absolute;margin-left:0pt;margin-top:-1.55pt;width:453.55pt;height:1.45pt;mso-wrap-style:none;v-text-anchor:middle;mso-position-vertical:top">
+                <v:fill o:detectmouseclick="t" type="solid" color2="black"/>
+                <v:stroke color="black" joinstyle="round" endcap="flat"/>
+                <w10:wrap type="square"/>
+              </v:rect>
             </w:pict>
-          </ns1:Fallback>
-        </ns1:AlternateContent>
+          </mc:Fallback>
+        </mc:AlternateContent>
       </w:r>
       <w:bookmarkEnd w:id="2"/>
     </w:p>
@@ -1974,60 +1972,60 @@
       </w:pPr>
       <w:r>
         <w:rPr/>
-        <ns1:AlternateContent>
-          <ns1:Choice Requires="wps">
+        <mc:AlternateContent>
+          <mc:Choice Requires="wps">
             <w:drawing>
-              <ns3:inline distT="0" distB="0" distL="0" distR="0">
-                <ns3:extent cx="5760720" cy="19050"/>
-                <ns3:effectExtent l="0" t="0" r="0" b="0"/>
-                <ns3:docPr id="4" name="Shape4"/>
-                <ns4:graphic>
-                  <ns4:graphicData uri="http://schemas.microsoft.com/office/word/2010/wordprocessingShape">
-                    <ns6:wsp>
-                      <ns6:cNvSpPr/>
-                      <ns6:spPr>
-                        <ns4:xfrm>
-                          <ns4:off x="0" y="0"/>
-                          <ns4:ext cx="5760720" cy="19080"/>
-                        </ns4:xfrm>
-                        <ns4:prstGeom prst="rect">
-                          <ns4:avLst/>
-                        </ns4:prstGeom>
-                        <ns4:solidFill>
-                          <ns4:srgbClr val="FFFFFF"/>
-                        </ns4:solidFill>
-                        <ns4:ln w="0">
-                          <ns4:solidFill>
-                            <ns4:srgbClr val="000000"/>
-                          </ns4:solidFill>
-                        </ns4:ln>
-                      </ns6:spPr>
-                      <ns6:style>
-                        <ns4:lnRef idx="0"/>
-                        <ns4:fillRef idx="0"/>
-                        <ns4:effectRef idx="0"/>
-                        <ns4:fontRef idx="minor"/>
-                      </ns6:style>
-                      <ns6:bodyPr/>
-                    </ns6:wsp>
-                  </ns4:graphicData>
-                </ns4:graphic>
-                <ns7:sizeRelH relativeFrom="page">
-                  <ns7:pctWidth>100000</ns7:pctWidth>
-                </ns7:sizeRelH>
-              </ns3:inline>
+              <wp:inline distT="0" distB="0" distL="0" distR="0">
+                <wp:extent cx="5760720" cy="19050"/>
+                <wp:effectExtent l="0" t="0" r="0" b="0"/>
+                <wp:docPr id="4" name="Shape4"/>
+                <a:graphic xmlns:a="http://schemas.openxmlformats.org/drawingml/2006/main">
+                  <a:graphicData uri="http://schemas.microsoft.com/office/word/2010/wordprocessingShape">
+                    <wps:wsp>
+                      <wps:cNvSpPr/>
+                      <wps:spPr>
+                        <a:xfrm>
+                          <a:off x="0" y="0"/>
+                          <a:ext cx="5760720" cy="19080"/>
+                        </a:xfrm>
+                        <a:prstGeom prst="rect">
+                          <a:avLst/>
+                        </a:prstGeom>
+                        <a:solidFill>
+                          <a:srgbClr val="FFFFFF"/>
+                        </a:solidFill>
+                        <a:ln w="0">
+                          <a:solidFill>
+                            <a:srgbClr val="000000"/>
+                          </a:solidFill>
+                        </a:ln>
+                      </wps:spPr>
+                      <wps:style>
+                        <a:lnRef idx="0"/>
+                        <a:fillRef idx="0"/>
+                        <a:effectRef idx="0"/>
+                        <a:fontRef idx="minor"/>
+                      </wps:style>
+                      <wps:bodyPr/>
+                    </wps:wsp>
+                  </a:graphicData>
+                </a:graphic>
+                <wp14:sizeRelH relativeFrom="page">
+                  <wp14:pctWidth>100000</wp14:pctWidth>
+                </wp14:sizeRelH>
+              </wp:inline>
             </w:drawing>
-          </ns1:Choice>
-          <ns1:Fallback>
+          </mc:Choice>
+          <mc:Fallback>
             <w:pict>
-              <ns8:rect id="shape_0" fillcolor="white" stroked="t" ns9:allowincell="f" style="position:absolute;margin-left:0pt;margin-top:-1.55pt;width:453.55pt;height:1.45pt;mso-wrap-style:none;v-text-anchor:middle;mso-position-vertical:top">
-                <ns8:fill ns9:detectmouseclick="t" type="solid" color2="black"/>
-                <ns8:stroke color="black" joinstyle="round" endcap="flat"/>
-                <ns10:wrap type="square"/>
-              </ns8:rect>
+              <v:rect id="shape_0" fillcolor="white" stroked="t" o:allowincell="f" style="position:absolute;margin-left:0pt;margin-top:-1.55pt;width:453.55pt;height:1.45pt;mso-wrap-style:none;v-text-anchor:middle;mso-position-vertical:top">
+                <v:fill o:detectmouseclick="t" type="solid" color2="black"/>
+                <v:stroke color="black" joinstyle="round" endcap="flat"/>
+                <w10:wrap type="square"/>
+              </v:rect>
             </w:pict>
-          </ns1:Fallback>
-        </ns1:AlternateContent>
+          </mc:Fallback>
+        </mc:AlternateContent>
       </w:r>
       <w:bookmarkEnd w:id="3"/>
     </w:p>
@@ -2130,60 +2128,60 @@
       </w:pPr>
       <w:r>
         <w:rPr/>
-        <ns1:AlternateContent>
-          <ns1:Choice Requires="wps">
+        <mc:AlternateContent>
+          <mc:Choice Requires="wps">
             <w:drawing>
-              <ns3:inline distT="0" distB="0" distL="0" distR="0">
-                <ns3:extent cx="5760720" cy="19050"/>
-                <ns3:effectExtent l="0" t="0" r="0" b="0"/>
-                <ns3:docPr id="5" name="Shape5"/>
-                <ns4:graphic>
-                  <ns4:graphicData uri="http://schemas.microsoft.com/office/word/2010/wordprocessingShape">
-                    <ns6:wsp>
-                      <ns6:cNvSpPr/>
-                      <ns6:spPr>
-                        <ns4:xfrm>
-                          <ns4:off x="0" y="0"/>
-                          <ns4:ext cx="5760720" cy="19080"/>
-                        </ns4:xfrm>
-                        <ns4:prstGeom prst="rect">
-                          <ns4:avLst/>
-                        </ns4:prstGeom>
-                        <ns4:solidFill>
-                          <ns4:srgbClr val="FFFFFF"/>
-                        </ns4:solidFill>
-                        <ns4:ln w="0">
-                          <ns4:solidFill>
-                            <ns4:srgbClr val="000000"/>
-                          </ns4:solidFill>
-                        </ns4:ln>
-                      </ns6:spPr>
-                      <ns6:style>
-                        <ns4:lnRef idx="0"/>
-                        <ns4:fillRef idx="0"/>
-                        <ns4:effectRef idx="0"/>
-                        <ns4:fontRef idx="minor"/>
-                      </ns6:style>
-                      <ns6:bodyPr/>
-                    </ns6:wsp>
-                  </ns4:graphicData>
-                </ns4:graphic>
-                <ns7:sizeRelH relativeFrom="page">
-                  <ns7:pctWidth>100000</ns7:pctWidth>
-                </ns7:sizeRelH>
-              </ns3:inline>
+              <wp:inline distT="0" distB="0" distL="0" distR="0">
+                <wp:extent cx="5760720" cy="19050"/>
+                <wp:effectExtent l="0" t="0" r="0" b="0"/>
+                <wp:docPr id="5" name="Shape5"/>
+                <a:graphic xmlns:a="http://schemas.openxmlformats.org/drawingml/2006/main">
+                  <a:graphicData uri="http://schemas.microsoft.com/office/word/2010/wordprocessingShape">
+                    <wps:wsp>
+                      <wps:cNvSpPr/>
+                      <wps:spPr>
+                        <a:xfrm>
+                          <a:off x="0" y="0"/>
+                          <a:ext cx="5760720" cy="19080"/>
+                        </a:xfrm>
+                        <a:prstGeom prst="rect">
+                          <a:avLst/>
+                        </a:prstGeom>
+                        <a:solidFill>
+                          <a:srgbClr val="FFFFFF"/>
+                        </a:solidFill>
+                        <a:ln w="0">
+                          <a:solidFill>
+                            <a:srgbClr val="000000"/>
+                          </a:solidFill>
+                        </a:ln>
+                      </wps:spPr>
+                      <wps:style>
+                        <a:lnRef idx="0"/>
+                        <a:fillRef idx="0"/>
+                        <a:effectRef idx="0"/>
+                        <a:fontRef idx="minor"/>
+                      </wps:style>
+                      <wps:bodyPr/>
+                    </wps:wsp>
+                  </a:graphicData>
+                </a:graphic>
+                <wp14:sizeRelH relativeFrom="page">
+                  <wp14:pctWidth>100000</wp14:pctWidth>
+                </wp14:sizeRelH>
+              </wp:inline>
             </w:drawing>
-          </ns1:Choice>
-          <ns1:Fallback>
+          </mc:Choice>
+          <mc:Fallback>
             <w:pict>
-              <ns8:rect id="shape_0" fillcolor="white" stroked="t" ns9:allowincell="f" style="position:absolute;margin-left:0pt;margin-top:-1.55pt;width:453.55pt;height:1.45pt;mso-wrap-style:none;v-text-anchor:middle;mso-position-vertical:top">
-                <ns8:fill ns9:detectmouseclick="t" type="solid" color2="black"/>
-                <ns8:stroke color="black" joinstyle="round" endcap="flat"/>
-                <ns10:wrap type="square"/>
-              </ns8:rect>
+              <v:rect id="shape_0" fillcolor="white" stroked="t" o:allowincell="f" style="position:absolute;margin-left:0pt;margin-top:-1.55pt;width:453.55pt;height:1.45pt;mso-wrap-style:none;v-text-anchor:middle;mso-position-vertical:top">
+                <v:fill o:detectmouseclick="t" type="solid" color2="black"/>
+                <v:stroke color="black" joinstyle="round" endcap="flat"/>
+                <w10:wrap type="square"/>
+              </v:rect>
             </w:pict>
-          </ns1:Fallback>
-        </ns1:AlternateContent>
+          </mc:Fallback>
+        </mc:AlternateContent>
       </w:r>
       <w:bookmarkEnd w:id="4"/>
     </w:p>
@@ -2653,60 +2651,60 @@
       </w:pPr>
       <w:r>
         <w:rPr/>
-        <ns1:AlternateContent>
-          <ns1:Choice Requires="wps">
+        <mc:AlternateContent>
+          <mc:Choice Requires="wps">
             <w:drawing>
-              <ns3:inline distT="0" distB="0" distL="0" distR="0">
-                <ns3:extent cx="5760720" cy="19050"/>
-                <ns3:effectExtent l="0" t="0" r="0" b="0"/>
-                <ns3:docPr id="6" name="Shape6"/>
-                <ns4:graphic>
-                  <ns4:graphicData uri="http://schemas.microsoft.com/office/word/2010/wordprocessingShape">
-                    <ns6:wsp>
-                      <ns6:cNvSpPr/>
-                      <ns6:spPr>
-                        <ns4:xfrm>
-                          <ns4:off x="0" y="0"/>
-                          <ns4:ext cx="5760720" cy="19080"/>
-                        </ns4:xfrm>
-                        <ns4:prstGeom prst="rect">
-                          <ns4:avLst/>
-                        </ns4:prstGeom>
-                        <ns4:solidFill>
-                          <ns4:srgbClr val="FFFFFF"/>
-                        </ns4:solidFill>
-                        <ns4:ln w="0">
-                          <ns4:solidFill>
-                            <ns4:srgbClr val="000000"/>
-                          </ns4:solidFill>
-                        </ns4:ln>
-                      </ns6:spPr>
-                      <ns6:style>
-                        <ns4:lnRef idx="0"/>
-                        <ns4:fillRef idx="0"/>
-                        <ns4:effectRef idx="0"/>
-                        <ns4:fontRef idx="minor"/>
-                      </ns6:style>
-                      <ns6:bodyPr/>
-                    </ns6:wsp>
-                  </ns4:graphicData>
-                </ns4:graphic>
-                <ns7:sizeRelH relativeFrom="page">
-                  <ns7:pctWidth>100000</ns7:pctWidth>
-                </ns7:sizeRelH>
-              </ns3:inline>
+              <wp:inline distT="0" distB="0" distL="0" distR="0">
+                <wp:extent cx="5760720" cy="19050"/>
+                <wp:effectExtent l="0" t="0" r="0" b="0"/>
+                <wp:docPr id="6" name="Shape6"/>
+                <a:graphic xmlns:a="http://schemas.openxmlformats.org/drawingml/2006/main">
+                  <a:graphicData uri="http://schemas.microsoft.com/office/word/2010/wordprocessingShape">
+                    <wps:wsp>
+                      <wps:cNvSpPr/>
+                      <wps:spPr>
+                        <a:xfrm>
+                          <a:off x="0" y="0"/>
+                          <a:ext cx="5760720" cy="19080"/>
+                        </a:xfrm>
+                        <a:prstGeom prst="rect">
+                          <a:avLst/>
+                        </a:prstGeom>
+                        <a:solidFill>
+                          <a:srgbClr val="FFFFFF"/>
+                        </a:solidFill>
+                        <a:ln w="0">
+                          <a:solidFill>
+                            <a:srgbClr val="000000"/>
+                          </a:solidFill>
+                        </a:ln>
+                      </wps:spPr>
+                      <wps:style>
+                        <a:lnRef idx="0"/>
+                        <a:fillRef idx="0"/>
+                        <a:effectRef idx="0"/>
+                        <a:fontRef idx="minor"/>
+                      </wps:style>
+                      <wps:bodyPr/>
+                    </wps:wsp>
+                  </a:graphicData>
+                </a:graphic>
+                <wp14:sizeRelH relativeFrom="page">
+                  <wp14:pctWidth>100000</wp14:pctWidth>
+                </wp14:sizeRelH>
+              </wp:inline>
             </w:drawing>
-          </ns1:Choice>
-          <ns1:Fallback>
+          </mc:Choice>
+          <mc:Fallback>
             <w:pict>
-              <ns8:rect id="shape_0" fillcolor="white" stroked="t" ns9:allowincell="f" style="position:absolute;margin-left:0pt;margin-top:-1.55pt;width:453.55pt;height:1.45pt;mso-wrap-style:none;v-text-anchor:middle;mso-position-vertical:top">
-                <ns8:fill ns9:detectmouseclick="t" type="solid" color2="black"/>
-                <ns8:stroke color="black" joinstyle="round" endcap="flat"/>
-                <ns10:wrap type="square"/>
-              </ns8:rect>
+              <v:rect id="shape_0" fillcolor="white" stroked="t" o:allowincell="f" style="position:absolute;margin-left:0pt;margin-top:-1.55pt;width:453.55pt;height:1.45pt;mso-wrap-style:none;v-text-anchor:middle;mso-position-vertical:top">
+                <v:fill o:detectmouseclick="t" type="solid" color2="black"/>
+                <v:stroke color="black" joinstyle="round" endcap="flat"/>
+                <w10:wrap type="square"/>
+              </v:rect>
             </w:pict>
-          </ns1:Fallback>
-        </ns1:AlternateContent>
+          </mc:Fallback>
+        </mc:AlternateContent>
       </w:r>
       <w:bookmarkEnd w:id="5"/>
     </w:p>
@@ -3176,60 +3174,60 @@
       </w:pPr>
       <w:r>
         <w:rPr/>
-        <ns1:AlternateContent>
-          <ns1:Choice Requires="wps">
+        <mc:AlternateContent>
+          <mc:Choice Requires="wps">
             <w:drawing>
-              <ns3:inline distT="0" distB="0" distL="0" distR="0">
-                <ns3:extent cx="5760720" cy="19050"/>
-                <ns3:effectExtent l="0" t="0" r="0" b="0"/>
-                <ns3:docPr id="7" name="Shape7"/>
-                <ns4:graphic>
-                  <ns4:graphicData uri="http://schemas.microsoft.com/office/word/2010/wordprocessingShape">
-                    <ns6:wsp>
-                      <ns6:cNvSpPr/>
-                      <ns6:spPr>
-                        <ns4:xfrm>
-                          <ns4:off x="0" y="0"/>
-                          <ns4:ext cx="5760720" cy="19080"/>
-                        </ns4:xfrm>
-                        <ns4:prstGeom prst="rect">
-                          <ns4:avLst/>
-                        </ns4:prstGeom>
-                        <ns4:solidFill>
-                          <ns4:srgbClr val="FFFFFF"/>
-                        </ns4:solidFill>
-                        <ns4:ln w="0">
-                          <ns4:solidFill>
-                            <ns4:srgbClr val="000000"/>
-                          </ns4:solidFill>
-                        </ns4:ln>
-                      </ns6:spPr>
-                      <ns6:style>
-                        <ns4:lnRef idx="0"/>
-                        <ns4:fillRef idx="0"/>
-                        <ns4:effectRef idx="0"/>
-                        <ns4:fontRef idx="minor"/>
-                      </ns6:style>
-                      <ns6:bodyPr/>
-                    </ns6:wsp>
-                  </ns4:graphicData>
-                </ns4:graphic>
-                <ns7:sizeRelH relativeFrom="page">
-                  <ns7:pctWidth>100000</ns7:pctWidth>
-                </ns7:sizeRelH>
-              </ns3:inline>
+              <wp:inline distT="0" distB="0" distL="0" distR="0">
+                <wp:extent cx="5760720" cy="19050"/>
+                <wp:effectExtent l="0" t="0" r="0" b="0"/>
+                <wp:docPr id="7" name="Shape7"/>
+                <a:graphic xmlns:a="http://schemas.openxmlformats.org/drawingml/2006/main">
+                  <a:graphicData uri="http://schemas.microsoft.com/office/word/2010/wordprocessingShape">
+                    <wps:wsp>
+                      <wps:cNvSpPr/>
+                      <wps:spPr>
+                        <a:xfrm>
+                          <a:off x="0" y="0"/>
+                          <a:ext cx="5760720" cy="19080"/>
+                        </a:xfrm>
+                        <a:prstGeom prst="rect">
+                          <a:avLst/>
+                        </a:prstGeom>
+                        <a:solidFill>
+                          <a:srgbClr val="FFFFFF"/>
+                        </a:solidFill>
+                        <a:ln w="0">
+                          <a:solidFill>
+                            <a:srgbClr val="000000"/>
+                          </a:solidFill>
+                        </a:ln>
+                      </wps:spPr>
+                      <wps:style>
+                        <a:lnRef idx="0"/>
+                        <a:fillRef idx="0"/>
+                        <a:effectRef idx="0"/>
+                        <a:fontRef idx="minor"/>
+                      </wps:style>
+                      <wps:bodyPr/>
+                    </wps:wsp>
+                  </a:graphicData>
+                </a:graphic>
+                <wp14:sizeRelH relativeFrom="page">
+                  <wp14:pctWidth>100000</wp14:pctWidth>
+                </wp14:sizeRelH>
+              </wp:inline>
             </w:drawing>
-          </ns1:Choice>
-          <ns1:Fallback>
+          </mc:Choice>
+          <mc:Fallback>
             <w:pict>
-              <ns8:rect id="shape_0" fillcolor="white" stroked="t" ns9:allowincell="f" style="position:absolute;margin-left:0pt;margin-top:-1.55pt;width:453.55pt;height:1.45pt;mso-wrap-style:none;v-text-anchor:middle;mso-position-vertical:top">
-                <ns8:fill ns9:detectmouseclick="t" type="solid" color2="black"/>
-                <ns8:stroke color="black" joinstyle="round" endcap="flat"/>
-                <ns10:wrap type="square"/>
-              </ns8:rect>
+              <v:rect id="shape_0" fillcolor="white" stroked="t" o:allowincell="f" style="position:absolute;margin-left:0pt;margin-top:-1.55pt;width:453.55pt;height:1.45pt;mso-wrap-style:none;v-text-anchor:middle;mso-position-vertical:top">
+                <v:fill o:detectmouseclick="t" type="solid" color2="black"/>
+                <v:stroke color="black" joinstyle="round" endcap="flat"/>
+                <w10:wrap type="square"/>
+              </v:rect>
             </w:pict>
-          </ns1:Fallback>
-        </ns1:AlternateContent>
+          </mc:Fallback>
+        </mc:AlternateContent>
       </w:r>
       <w:bookmarkEnd w:id="6"/>
     </w:p>
@@ -3669,60 +3667,60 @@
       </w:pPr>
       <w:r>
         <w:rPr/>
-        <ns1:AlternateContent>
-          <ns1:Choice Requires="wps">
+        <mc:AlternateContent>
+          <mc:Choice Requires="wps">
             <w:drawing>
-              <ns3:inline distT="0" distB="0" distL="0" distR="0">
-                <ns3:extent cx="5760720" cy="19050"/>
-                <ns3:effectExtent l="0" t="0" r="0" b="0"/>
-                <ns3:docPr id="8" name="Shape8"/>
-                <ns4:graphic>
-                  <ns4:graphicData uri="http://schemas.microsoft.com/office/word/2010/wordprocessingShape">
-                    <ns6:wsp>
-                      <ns6:cNvSpPr/>
-                      <ns6:spPr>
-                        <ns4:xfrm>
-                          <ns4:off x="0" y="0"/>
-                          <ns4:ext cx="5760720" cy="19080"/>
-                        </ns4:xfrm>
-                        <ns4:prstGeom prst="rect">
-                          <ns4:avLst/>
-                        </ns4:prstGeom>
-                        <ns4:solidFill>
-                          <ns4:srgbClr val="FFFFFF"/>
-                        </ns4:solidFill>
-                        <ns4:ln w="0">
-                          <ns4:solidFill>
-                            <ns4:srgbClr val="000000"/>
-                          </ns4:solidFill>
-                        </ns4:ln>
-                      </ns6:spPr>
-                      <ns6:style>
-                        <ns4:lnRef idx="0"/>
-                        <ns4:fillRef idx="0"/>
-                        <ns4:effectRef idx="0"/>
-                        <ns4:fontRef idx="minor"/>
-                      </ns6:style>
-                      <ns6:bodyPr/>
-                    </ns6:wsp>
-                  </ns4:graphicData>
-                </ns4:graphic>
-                <ns7:sizeRelH relativeFrom="page">
-                  <ns7:pctWidth>100000</ns7:pctWidth>
-                </ns7:sizeRelH>
-              </ns3:inline>
+              <wp:inline distT="0" distB="0" distL="0" distR="0">
+                <wp:extent cx="5760720" cy="19050"/>
+                <wp:effectExtent l="0" t="0" r="0" b="0"/>
+                <wp:docPr id="8" name="Shape8"/>
+                <a:graphic xmlns:a="http://schemas.openxmlformats.org/drawingml/2006/main">
+                  <a:graphicData uri="http://schemas.microsoft.com/office/word/2010/wordprocessingShape">
+                    <wps:wsp>
+                      <wps:cNvSpPr/>
+                      <wps:spPr>
+                        <a:xfrm>
+                          <a:off x="0" y="0"/>
+                          <a:ext cx="5760720" cy="19080"/>
+                        </a:xfrm>
+                        <a:prstGeom prst="rect">
+                          <a:avLst/>
+                        </a:prstGeom>
+                        <a:solidFill>
+                          <a:srgbClr val="FFFFFF"/>
+                        </a:solidFill>
+                        <a:ln w="0">
+                          <a:solidFill>
+                            <a:srgbClr val="000000"/>
+                          </a:solidFill>
+                        </a:ln>
+                      </wps:spPr>
+                      <wps:style>
+                        <a:lnRef idx="0"/>
+                        <a:fillRef idx="0"/>
+                        <a:effectRef idx="0"/>
+                        <a:fontRef idx="minor"/>
+                      </wps:style>
+                      <wps:bodyPr/>
+                    </wps:wsp>
+                  </a:graphicData>
+                </a:graphic>
+                <wp14:sizeRelH relativeFrom="page">
+                  <wp14:pctWidth>100000</wp14:pctWidth>
+                </wp14:sizeRelH>
+              </wp:inline>
             </w:drawing>
-          </ns1:Choice>
-          <ns1:Fallback>
+          </mc:Choice>
+          <mc:Fallback>
             <w:pict>
-              <ns8:rect id="shape_0" fillcolor="white" stroked="t" ns9:allowincell="f" style="position:absolute;margin-left:0pt;margin-top:-1.55pt;width:453.55pt;height:1.45pt;mso-wrap-style:none;v-text-anchor:middle;mso-position-vertical:top">
-                <ns8:fill ns9:detectmouseclick="t" type="solid" color2="black"/>
-                <ns8:stroke color="black" joinstyle="round" endcap="flat"/>
-                <ns10:wrap type="square"/>
-              </ns8:rect>
+              <v:rect id="shape_0" fillcolor="white" stroked="t" o:allowincell="f" style="position:absolute;margin-left:0pt;margin-top:-1.55pt;width:453.55pt;height:1.45pt;mso-wrap-style:none;v-text-anchor:middle;mso-position-vertical:top">
+                <v:fill o:detectmouseclick="t" type="solid" color2="black"/>
+                <v:stroke color="black" joinstyle="round" endcap="flat"/>
+                <w10:wrap type="square"/>
+              </v:rect>
             </w:pict>
-          </ns1:Fallback>
-        </ns1:AlternateContent>
+          </mc:Fallback>
+        </mc:AlternateContent>
       </w:r>
       <w:bookmarkEnd w:id="7"/>
     </w:p>
@@ -4162,60 +4160,60 @@
       </w:pPr>
       <w:r>
         <w:rPr/>
-        <ns1:AlternateContent>
-          <ns1:Choice Requires="wps">
+        <mc:AlternateContent>
+          <mc:Choice Requires="wps">
             <w:drawing>
-              <ns3:inline distT="0" distB="0" distL="0" distR="0">
-                <ns3:extent cx="5760720" cy="19050"/>
-                <ns3:effectExtent l="0" t="0" r="0" b="0"/>
-                <ns3:docPr id="9" name="Shape9"/>
-                <ns4:graphic>
-                  <ns4:graphicData uri="http://schemas.microsoft.com/office/word/2010/wordprocessingShape">
-                    <ns6:wsp>
-                      <ns6:cNvSpPr/>
-                      <ns6:spPr>
-                        <ns4:xfrm>
-                          <ns4:off x="0" y="0"/>
-                          <ns4:ext cx="5760720" cy="19080"/>
-                        </ns4:xfrm>
-                        <ns4:prstGeom prst="rect">
-                          <ns4:avLst/>
-                        </ns4:prstGeom>
-                        <ns4:solidFill>
-                          <ns4:srgbClr val="FFFFFF"/>
-                        </ns4:solidFill>
-                        <ns4:ln w="0">
-                          <ns4:solidFill>
-                            <ns4:srgbClr val="000000"/>
-                          </ns4:solidFill>
-                        </ns4:ln>
-                      </ns6:spPr>
-                      <ns6:style>
-                        <ns4:lnRef idx="0"/>
-                        <ns4:fillRef idx="0"/>
-                        <ns4:effectRef idx="0"/>
-                        <ns4:fontRef idx="minor"/>
-                      </ns6:style>
-                      <ns6:bodyPr/>
-                    </ns6:wsp>
-                  </ns4:graphicData>
-                </ns4:graphic>
-                <ns7:sizeRelH relativeFrom="page">
-                  <ns7:pctWidth>100000</ns7:pctWidth>
-                </ns7:sizeRelH>
-              </ns3:inline>
+              <wp:inline distT="0" distB="0" distL="0" distR="0">
+                <wp:extent cx="5760720" cy="19050"/>
+                <wp:effectExtent l="0" t="0" r="0" b="0"/>
+                <wp:docPr id="9" name="Shape9"/>
+                <a:graphic xmlns:a="http://schemas.openxmlformats.org/drawingml/2006/main">
+                  <a:graphicData uri="http://schemas.microsoft.com/office/word/2010/wordprocessingShape">
+                    <wps:wsp>
+                      <wps:cNvSpPr/>
+                      <wps:spPr>
+                        <a:xfrm>
+                          <a:off x="0" y="0"/>
+                          <a:ext cx="5760720" cy="19080"/>
+                        </a:xfrm>
+                        <a:prstGeom prst="rect">
+                          <a:avLst/>
+                        </a:prstGeom>
+                        <a:solidFill>
+                          <a:srgbClr val="FFFFFF"/>
+                        </a:solidFill>
+                        <a:ln w="0">
+                          <a:solidFill>
+                            <a:srgbClr val="000000"/>
+                          </a:solidFill>
+                        </a:ln>
+                      </wps:spPr>
+                      <wps:style>
+                        <a:lnRef idx="0"/>
+                        <a:fillRef idx="0"/>
+                        <a:effectRef idx="0"/>
+                        <a:fontRef idx="minor"/>
+                      </wps:style>
+                      <wps:bodyPr/>
+                    </wps:wsp>
+                  </a:graphicData>
+                </a:graphic>
+                <wp14:sizeRelH relativeFrom="page">
+                  <wp14:pctWidth>100000</wp14:pctWidth>
+                </wp14:sizeRelH>
+              </wp:inline>
             </w:drawing>
-          </ns1:Choice>
-          <ns1:Fallback>
+          </mc:Choice>
+          <mc:Fallback>
             <w:pict>
-              <ns8:rect id="shape_0" fillcolor="white" stroked="t" ns9:allowincell="f" style="position:absolute;margin-left:0pt;margin-top:-1.55pt;width:453.55pt;height:1.45pt;mso-wrap-style:none;v-text-anchor:middle;mso-position-vertical:top">
-                <ns8:fill ns9:detectmouseclick="t" type="solid" color2="black"/>
-                <ns8:stroke color="black" joinstyle="round" endcap="flat"/>
-                <ns10:wrap type="square"/>
-              </ns8:rect>
+              <v:rect id="shape_0" fillcolor="white" stroked="t" o:allowincell="f" style="position:absolute;margin-left:0pt;margin-top:-1.55pt;width:453.55pt;height:1.45pt;mso-wrap-style:none;v-text-anchor:middle;mso-position-vertical:top">
+                <v:fill o:detectmouseclick="t" type="solid" color2="black"/>
+                <v:stroke color="black" joinstyle="round" endcap="flat"/>
+                <w10:wrap type="square"/>
+              </v:rect>
             </w:pict>
-          </ns1:Fallback>
-        </ns1:AlternateContent>
+          </mc:Fallback>
+        </mc:AlternateContent>
       </w:r>
       <w:bookmarkEnd w:id="8"/>
     </w:p>
@@ -4630,60 +4628,60 @@
       </w:pPr>
       <w:r>
         <w:rPr/>
-        <ns1:AlternateContent>
-          <ns1:Choice Requires="wps">
+        <mc:AlternateContent>
+          <mc:Choice Requires="wps">
             <w:drawing>
-              <ns3:inline distT="0" distB="0" distL="0" distR="0">
-                <ns3:extent cx="5760720" cy="19050"/>
-                <ns3:effectExtent l="0" t="0" r="0" b="0"/>
-                <ns3:docPr id="10" name="Shape10"/>
-                <ns4:graphic>
-                  <ns4:graphicData uri="http://schemas.microsoft.com/office/word/2010/wordprocessingShape">
-                    <ns6:wsp>
-                      <ns6:cNvSpPr/>
-                      <ns6:spPr>
-                        <ns4:xfrm>
-                          <ns4:off x="0" y="0"/>
-                          <ns4:ext cx="5760720" cy="19080"/>
-                        </ns4:xfrm>
-                        <ns4:prstGeom prst="rect">
-                          <ns4:avLst/>
-                        </ns4:prstGeom>
-                        <ns4:solidFill>
-                          <ns4:srgbClr val="FFFFFF"/>
-                        </ns4:solidFill>
-                        <ns4:ln w="0">
-                          <ns4:solidFill>
-                            <ns4:srgbClr val="000000"/>
-                          </ns4:solidFill>
-                        </ns4:ln>
-                      </ns6:spPr>
-                      <ns6:style>
-                        <ns4:lnRef idx="0"/>
-                        <ns4:fillRef idx="0"/>
-                        <ns4:effectRef idx="0"/>
-                        <ns4:fontRef idx="minor"/>
-                      </ns6:style>
-                      <ns6:bodyPr/>
-                    </ns6:wsp>
-                  </ns4:graphicData>
-                </ns4:graphic>
-                <ns7:sizeRelH relativeFrom="page">
-                  <ns7:pctWidth>100000</ns7:pctWidth>
-                </ns7:sizeRelH>
-              </ns3:inline>
+              <wp:inline distT="0" distB="0" distL="0" distR="0">
+                <wp:extent cx="5760720" cy="19050"/>
+                <wp:effectExtent l="0" t="0" r="0" b="0"/>
+                <wp:docPr id="10" name="Shape10"/>
+                <a:graphic xmlns:a="http://schemas.openxmlformats.org/drawingml/2006/main">
+                  <a:graphicData uri="http://schemas.microsoft.com/office/word/2010/wordprocessingShape">
+                    <wps:wsp>
+                      <wps:cNvSpPr/>
+                      <wps:spPr>
+                        <a:xfrm>
+                          <a:off x="0" y="0"/>
+                          <a:ext cx="5760720" cy="19080"/>
+                        </a:xfrm>
+                        <a:prstGeom prst="rect">
+                          <a:avLst/>
+                        </a:prstGeom>
+                        <a:solidFill>
+                          <a:srgbClr val="FFFFFF"/>
+                        </a:solidFill>
+                        <a:ln w="0">
+                          <a:solidFill>
+                            <a:srgbClr val="000000"/>
+                          </a:solidFill>
+                        </a:ln>
+                      </wps:spPr>
+                      <wps:style>
+                        <a:lnRef idx="0"/>
+                        <a:fillRef idx="0"/>
+                        <a:effectRef idx="0"/>
+                        <a:fontRef idx="minor"/>
+                      </wps:style>
+                      <wps:bodyPr/>
+                    </wps:wsp>
+                  </a:graphicData>
+                </a:graphic>
+                <wp14:sizeRelH relativeFrom="page">
+                  <wp14:pctWidth>100000</wp14:pctWidth>
+                </wp14:sizeRelH>
+              </wp:inline>
             </w:drawing>
-          </ns1:Choice>
-          <ns1:Fallback>
+          </mc:Choice>
+          <mc:Fallback>
             <w:pict>
-              <ns8:rect id="shape_0" fillcolor="white" stroked="t" ns9:allowincell="f" style="position:absolute;margin-left:0pt;margin-top:-1.55pt;width:453.55pt;height:1.45pt;mso-wrap-style:none;v-text-anchor:middle;mso-position-vertical:top">
-                <ns8:fill ns9:detectmouseclick="t" type="solid" color2="black"/>
-                <ns8:stroke color="black" joinstyle="round" endcap="flat"/>
-                <ns10:wrap type="square"/>
-              </ns8:rect>
+              <v:rect id="shape_0" fillcolor="white" stroked="t" o:allowincell="f" style="position:absolute;margin-left:0pt;margin-top:-1.55pt;width:453.55pt;height:1.45pt;mso-wrap-style:none;v-text-anchor:middle;mso-position-vertical:top">
+                <v:fill o:detectmouseclick="t" type="solid" color2="black"/>
+                <v:stroke color="black" joinstyle="round" endcap="flat"/>
+                <w10:wrap type="square"/>
+              </v:rect>
             </w:pict>
-          </ns1:Fallback>
-        </ns1:AlternateContent>
+          </mc:Fallback>
+        </mc:AlternateContent>
       </w:r>
       <w:bookmarkEnd w:id="9"/>
     </w:p>
@@ -4868,60 +4866,60 @@
       </w:pPr>
       <w:r>
         <w:rPr/>
-        <ns1:AlternateContent>
-          <ns1:Choice Requires="wps">
+        <mc:AlternateContent>
+          <mc:Choice Requires="wps">
             <w:drawing>
-              <ns3:inline distT="0" distB="0" distL="0" distR="0">
-                <ns3:extent cx="5760720" cy="19050"/>
-                <ns3:effectExtent l="0" t="0" r="0" b="0"/>
-                <ns3:docPr id="11" name="Shape11"/>
-                <ns4:graphic>
-                  <ns4:graphicData uri="http://schemas.microsoft.com/office/word/2010/wordprocessingShape">
-                    <ns6:wsp>
-                      <ns6:cNvSpPr/>
-                      <ns6:spPr>
-                        <ns4:xfrm>
-                          <ns4:off x="0" y="0"/>
-                          <ns4:ext cx="5760720" cy="19080"/>
-                        </ns4:xfrm>
-                        <ns4:prstGeom prst="rect">
-                          <ns4:avLst/>
-                        </ns4:prstGeom>
-                        <ns4:solidFill>
-                          <ns4:srgbClr val="FFFFFF"/>
-                        </ns4:solidFill>
-                        <ns4:ln w="0">
-                          <ns4:solidFill>
-                            <ns4:srgbClr val="000000"/>
-                          </ns4:solidFill>
-                        </ns4:ln>
-                      </ns6:spPr>
-                      <ns6:style>
-                        <ns4:lnRef idx="0"/>
-                        <ns4:fillRef idx="0"/>
-                        <ns4:effectRef idx="0"/>
-                        <ns4:fontRef idx="minor"/>
-                      </ns6:style>
-                      <ns6:bodyPr/>
-                    </ns6:wsp>
-                  </ns4:graphicData>
-                </ns4:graphic>
-                <ns7:sizeRelH relativeFrom="page">
-                  <ns7:pctWidth>100000</ns7:pctWidth>
-                </ns7:sizeRelH>
-              </ns3:inline>
+              <wp:inline distT="0" distB="0" distL="0" distR="0">
+                <wp:extent cx="5760720" cy="19050"/>
+                <wp:effectExtent l="0" t="0" r="0" b="0"/>
+                <wp:docPr id="11" name="Shape11"/>
+                <a:graphic xmlns:a="http://schemas.openxmlformats.org/drawingml/2006/main">
+                  <a:graphicData uri="http://schemas.microsoft.com/office/word/2010/wordprocessingShape">
+                    <wps:wsp>
+                      <wps:cNvSpPr/>
+                      <wps:spPr>
+                        <a:xfrm>
+                          <a:off x="0" y="0"/>
+                          <a:ext cx="5760720" cy="19080"/>
+                        </a:xfrm>
+                        <a:prstGeom prst="rect">
+                          <a:avLst/>
+                        </a:prstGeom>
+                        <a:solidFill>
+                          <a:srgbClr val="FFFFFF"/>
+                        </a:solidFill>
+                        <a:ln w="0">
+                          <a:solidFill>
+                            <a:srgbClr val="000000"/>
+                          </a:solidFill>
+                        </a:ln>
+                      </wps:spPr>
+                      <wps:style>
+                        <a:lnRef idx="0"/>
+                        <a:fillRef idx="0"/>
+                        <a:effectRef idx="0"/>
+                        <a:fontRef idx="minor"/>
+                      </wps:style>
+                      <wps:bodyPr/>
+                    </wps:wsp>
+                  </a:graphicData>
+                </a:graphic>
+                <wp14:sizeRelH relativeFrom="page">
+                  <wp14:pctWidth>100000</wp14:pctWidth>
+                </wp14:sizeRelH>
+              </wp:inline>
             </w:drawing>
-          </ns1:Choice>
-          <ns1:Fallback>
+          </mc:Choice>
+          <mc:Fallback>
             <w:pict>
-              <ns8:rect id="shape_0" fillcolor="white" stroked="t" ns9:allowincell="f" style="position:absolute;margin-left:0pt;margin-top:-1.55pt;width:453.55pt;height:1.45pt;mso-wrap-style:none;v-text-anchor:middle;mso-position-vertical:top">
-                <ns8:fill ns9:detectmouseclick="t" type="solid" color2="black"/>
-                <ns8:stroke color="black" joinstyle="round" endcap="flat"/>
-                <ns10:wrap type="square"/>
-              </ns8:rect>
+              <v:rect id="shape_0" fillcolor="white" stroked="t" o:allowincell="f" style="position:absolute;margin-left:0pt;margin-top:-1.55pt;width:453.55pt;height:1.45pt;mso-wrap-style:none;v-text-anchor:middle;mso-position-vertical:top">
+                <v:fill o:detectmouseclick="t" type="solid" color2="black"/>
+                <v:stroke color="black" joinstyle="round" endcap="flat"/>
+                <w10:wrap type="square"/>
+              </v:rect>
             </w:pict>
-          </ns1:Fallback>
-        </ns1:AlternateContent>
+          </mc:Fallback>
+        </mc:AlternateContent>
       </w:r>
       <w:bookmarkEnd w:id="10"/>
     </w:p>
@@ -5090,60 +5088,60 @@
       </w:pPr>
       <w:r>
         <w:rPr/>
-        <ns1:AlternateContent>
-          <ns1:Choice Requires="wps">
+        <mc:AlternateContent>
+          <mc:Choice Requires="wps">
             <w:drawing>
-              <ns3:inline distT="0" distB="0" distL="0" distR="0">
-                <ns3:extent cx="5760720" cy="19050"/>
-                <ns3:effectExtent l="0" t="0" r="0" b="0"/>
-                <ns3:docPr id="12" name="Shape12"/>
-                <ns4:graphic>
-                  <ns4:graphicData uri="http://schemas.microsoft.com/office/word/2010/wordprocessingShape">
-                    <ns6:wsp>
-                      <ns6:cNvSpPr/>
-                      <ns6:spPr>
-                        <ns4:xfrm>
-                          <ns4:off x="0" y="0"/>
-                          <ns4:ext cx="5760720" cy="19080"/>
-                        </ns4:xfrm>
-                        <ns4:prstGeom prst="rect">
-                          <ns4:avLst/>
-                        </ns4:prstGeom>
-                        <ns4:solidFill>
-                          <ns4:srgbClr val="FFFFFF"/>
-                        </ns4:solidFill>
-                        <ns4:ln w="0">
-                          <ns4:solidFill>
-                            <ns4:srgbClr val="000000"/>
-                          </ns4:solidFill>
-                        </ns4:ln>
-                      </ns6:spPr>
-                      <ns6:style>
-                        <ns4:lnRef idx="0"/>
-                        <ns4:fillRef idx="0"/>
-                        <ns4:effectRef idx="0"/>
-                        <ns4:fontRef idx="minor"/>
-                      </ns6:style>
-                      <ns6:bodyPr/>
-                    </ns6:wsp>
-                  </ns4:graphicData>
-                </ns4:graphic>
-                <ns7:sizeRelH relativeFrom="page">
-                  <ns7:pctWidth>100000</ns7:pctWidth>
-                </ns7:sizeRelH>
-              </ns3:inline>
+              <wp:inline distT="0" distB="0" distL="0" distR="0">
+                <wp:extent cx="5760720" cy="19050"/>
+                <wp:effectExtent l="0" t="0" r="0" b="0"/>
+                <wp:docPr id="12" name="Shape12"/>
+                <a:graphic xmlns:a="http://schemas.openxmlformats.org/drawingml/2006/main">
+                  <a:graphicData uri="http://schemas.microsoft.com/office/word/2010/wordprocessingShape">
+                    <wps:wsp>
+                      <wps:cNvSpPr/>
+                      <wps:spPr>
+                        <a:xfrm>
+                          <a:off x="0" y="0"/>
+                          <a:ext cx="5760720" cy="19080"/>
+                        </a:xfrm>
+                        <a:prstGeom prst="rect">
+                          <a:avLst/>
+                        </a:prstGeom>
+                        <a:solidFill>
+                          <a:srgbClr val="FFFFFF"/>
+                        </a:solidFill>
+                        <a:ln w="0">
+                          <a:solidFill>
+                            <a:srgbClr val="000000"/>
+                          </a:solidFill>
+                        </a:ln>
+                      </wps:spPr>
+                      <wps:style>
+                        <a:lnRef idx="0"/>
+                        <a:fillRef idx="0"/>
+                        <a:effectRef idx="0"/>
+                        <a:fontRef idx="minor"/>
+                      </wps:style>
+                      <wps:bodyPr/>
+                    </wps:wsp>
+                  </a:graphicData>
+                </a:graphic>
+                <wp14:sizeRelH relativeFrom="page">
+                  <wp14:pctWidth>100000</wp14:pctWidth>
+                </wp14:sizeRelH>
+              </wp:inline>
             </w:drawing>
-          </ns1:Choice>
-          <ns1:Fallback>
+          </mc:Choice>
+          <mc:Fallback>
             <w:pict>
-              <ns8:rect id="shape_0" fillcolor="white" stroked="t" ns9:allowincell="f" style="position:absolute;margin-left:0pt;margin-top:-1.55pt;width:453.55pt;height:1.45pt;mso-wrap-style:none;v-text-anchor:middle;mso-position-vertical:top">
-                <ns8:fill ns9:detectmouseclick="t" type="solid" color2="black"/>
-                <ns8:stroke color="black" joinstyle="round" endcap="flat"/>
-                <ns10:wrap type="square"/>
-              </ns8:rect>
+              <v:rect id="shape_0" fillcolor="white" stroked="t" o:allowincell="f" style="position:absolute;margin-left:0pt;margin-top:-1.55pt;width:453.55pt;height:1.45pt;mso-wrap-style:none;v-text-anchor:middle;mso-position-vertical:top">
+                <v:fill o:detectmouseclick="t" type="solid" color2="black"/>
+                <v:stroke color="black" joinstyle="round" endcap="flat"/>
+                <w10:wrap type="square"/>
+              </v:rect>
             </w:pict>
-          </ns1:Fallback>
-        </ns1:AlternateContent>
+          </mc:Fallback>
+        </mc:AlternateContent>
       </w:r>
       <w:bookmarkEnd w:id="11"/>
     </w:p>
@@ -5497,60 +5495,60 @@
       </w:pPr>
       <w:r>
         <w:rPr/>
-        <ns1:AlternateContent>
-          <ns1:Choice Requires="wps">
+        <mc:AlternateContent>
+          <mc:Choice Requires="wps">
             <w:drawing>
-              <ns3:inline distT="0" distB="0" distL="0" distR="0">
-                <ns3:extent cx="5760720" cy="19050"/>
-                <ns3:effectExtent l="0" t="0" r="0" b="0"/>
-                <ns3:docPr id="13" name="Shape13"/>
-                <ns4:graphic>
-                  <ns4:graphicData uri="http://schemas.microsoft.com/office/word/2010/wordprocessingShape">
-                    <ns6:wsp>
-                      <ns6:cNvSpPr/>
-                      <ns6:spPr>
-                        <ns4:xfrm>
-                          <ns4:off x="0" y="0"/>
-                          <ns4:ext cx="5760720" cy="19080"/>
-                        </ns4:xfrm>
-                        <ns4:prstGeom prst="rect">
-                          <ns4:avLst/>
-                        </ns4:prstGeom>
-                        <ns4:solidFill>
-                          <ns4:srgbClr val="FFFFFF"/>
-                        </ns4:solidFill>
-                        <ns4:ln w="0">
-                          <ns4:solidFill>
-                            <ns4:srgbClr val="000000"/>
-                          </ns4:solidFill>
-                        </ns4:ln>
-                      </ns6:spPr>
-                      <ns6:style>
-                        <ns4:lnRef idx="0"/>
-                        <ns4:fillRef idx="0"/>
-                        <ns4:effectRef idx="0"/>
-                        <ns4:fontRef idx="minor"/>
-                      </ns6:style>
-                      <ns6:bodyPr/>
-                    </ns6:wsp>
-                  </ns4:graphicData>
-                </ns4:graphic>
-                <ns7:sizeRelH relativeFrom="page">
-                  <ns7:pctWidth>100000</ns7:pctWidth>
-                </ns7:sizeRelH>
-              </ns3:inline>
+              <wp:inline distT="0" distB="0" distL="0" distR="0">
+                <wp:extent cx="5760720" cy="19050"/>
+                <wp:effectExtent l="0" t="0" r="0" b="0"/>
+                <wp:docPr id="13" name="Shape13"/>
+                <a:graphic xmlns:a="http://schemas.openxmlformats.org/drawingml/2006/main">
+                  <a:graphicData uri="http://schemas.microsoft.com/office/word/2010/wordprocessingShape">
+                    <wps:wsp>
+                      <wps:cNvSpPr/>
+                      <wps:spPr>
+                        <a:xfrm>
+                          <a:off x="0" y="0"/>
+                          <a:ext cx="5760720" cy="19080"/>
+                        </a:xfrm>
+                        <a:prstGeom prst="rect">
+                          <a:avLst/>
+                        </a:prstGeom>
+                        <a:solidFill>
+                          <a:srgbClr val="FFFFFF"/>
+                        </a:solidFill>
+                        <a:ln w="0">
+                          <a:solidFill>
+                            <a:srgbClr val="000000"/>
+                          </a:solidFill>
+                        </a:ln>
+                      </wps:spPr>
+                      <wps:style>
+                        <a:lnRef idx="0"/>
+                        <a:fillRef idx="0"/>
+                        <a:effectRef idx="0"/>
+                        <a:fontRef idx="minor"/>
+                      </wps:style>
+                      <wps:bodyPr/>
+                    </wps:wsp>
+                  </a:graphicData>
+                </a:graphic>
+                <wp14:sizeRelH relativeFrom="page">
+                  <wp14:pctWidth>100000</wp14:pctWidth>
+                </wp14:sizeRelH>
+              </wp:inline>
             </w:drawing>
-          </ns1:Choice>
-          <ns1:Fallback>
+          </mc:Choice>
+          <mc:Fallback>
             <w:pict>
-              <ns8:rect id="shape_0" fillcolor="white" stroked="t" ns9:allowincell="f" style="position:absolute;margin-left:0pt;margin-top:-1.55pt;width:453.55pt;height:1.45pt;mso-wrap-style:none;v-text-anchor:middle;mso-position-vertical:top">
-                <ns8:fill ns9:detectmouseclick="t" type="solid" color2="black"/>
-                <ns8:stroke color="black" joinstyle="round" endcap="flat"/>
-                <ns10:wrap type="square"/>
-              </ns8:rect>
+              <v:rect id="shape_0" fillcolor="white" stroked="t" o:allowincell="f" style="position:absolute;margin-left:0pt;margin-top:-1.55pt;width:453.55pt;height:1.45pt;mso-wrap-style:none;v-text-anchor:middle;mso-position-vertical:top">
+                <v:fill o:detectmouseclick="t" type="solid" color2="black"/>
+                <v:stroke color="black" joinstyle="round" endcap="flat"/>
+                <w10:wrap type="square"/>
+              </v:rect>
             </w:pict>
-          </ns1:Fallback>
-        </ns1:AlternateContent>
+          </mc:Fallback>
+        </mc:AlternateContent>
       </w:r>
       <w:bookmarkEnd w:id="12"/>
     </w:p>
@@ -10345,60 +10343,60 @@
       </w:pPr>
       <w:r>
         <w:rPr/>
-        <ns1:AlternateContent>
-          <ns1:Choice Requires="wps">
+        <mc:AlternateContent>
+          <mc:Choice Requires="wps">
             <w:drawing>
-              <ns3:inline distT="0" distB="0" distL="0" distR="0">
-                <ns3:extent cx="5760720" cy="19050"/>
-                <ns3:effectExtent l="0" t="0" r="0" b="0"/>
-                <ns3:docPr id="14" name="Shape14"/>
-                <ns4:graphic>
-                  <ns4:graphicData uri="http://schemas.microsoft.com/office/word/2010/wordprocessingShape">
-                    <ns6:wsp>
-                      <ns6:cNvSpPr/>
-                      <ns6:spPr>
-                        <ns4:xfrm>
-                          <ns4:off x="0" y="0"/>
-                          <ns4:ext cx="5760720" cy="19080"/>
-                        </ns4:xfrm>
-                        <ns4:prstGeom prst="rect">
-                          <ns4:avLst/>
-                        </ns4:prstGeom>
-                        <ns4:solidFill>
-                          <ns4:srgbClr val="FFFFFF"/>
-                        </ns4:solidFill>
-                        <ns4:ln w="0">
-                          <ns4:solidFill>
-                            <ns4:srgbClr val="000000"/>
-                          </ns4:solidFill>
-                        </ns4:ln>
-                      </ns6:spPr>
-                      <ns6:style>
-                        <ns4:lnRef idx="0"/>
-                        <ns4:fillRef idx="0"/>
-                        <ns4:effectRef idx="0"/>
-                        <ns4:fontRef idx="minor"/>
-                      </ns6:style>
-                      <ns6:bodyPr/>
-                    </ns6:wsp>
-                  </ns4:graphicData>
-                </ns4:graphic>
-                <ns7:sizeRelH relativeFrom="page">
-                  <ns7:pctWidth>100000</ns7:pctWidth>
-                </ns7:sizeRelH>
-              </ns3:inline>
+              <wp:inline distT="0" distB="0" distL="0" distR="0">
+                <wp:extent cx="5760720" cy="19050"/>
+                <wp:effectExtent l="0" t="0" r="0" b="0"/>
+                <wp:docPr id="14" name="Shape14"/>
+                <a:graphic xmlns:a="http://schemas.openxmlformats.org/drawingml/2006/main">
+                  <a:graphicData uri="http://schemas.microsoft.com/office/word/2010/wordprocessingShape">
+                    <wps:wsp>
+                      <wps:cNvSpPr/>
+                      <wps:spPr>
+                        <a:xfrm>
+                          <a:off x="0" y="0"/>
+                          <a:ext cx="5760720" cy="19080"/>
+                        </a:xfrm>
+                        <a:prstGeom prst="rect">
+                          <a:avLst/>
+                        </a:prstGeom>
+                        <a:solidFill>
+                          <a:srgbClr val="FFFFFF"/>
+                        </a:solidFill>
+                        <a:ln w="0">
+                          <a:solidFill>
+                            <a:srgbClr val="000000"/>
+                          </a:solidFill>
+                        </a:ln>
+                      </wps:spPr>
+                      <wps:style>
+                        <a:lnRef idx="0"/>
+                        <a:fillRef idx="0"/>
+                        <a:effectRef idx="0"/>
+                        <a:fontRef idx="minor"/>
+                      </wps:style>
+                      <wps:bodyPr/>
+                    </wps:wsp>
+                  </a:graphicData>
+                </a:graphic>
+                <wp14:sizeRelH relativeFrom="page">
+                  <wp14:pctWidth>100000</wp14:pctWidth>
+                </wp14:sizeRelH>
+              </wp:inline>
             </w:drawing>
-          </ns1:Choice>
-          <ns1:Fallback>
+          </mc:Choice>
+          <mc:Fallback>
             <w:pict>
-              <ns8:rect id="shape_0" fillcolor="white" stroked="t" ns9:allowincell="f" style="position:absolute;margin-left:0pt;margin-top:-1.55pt;width:453.55pt;height:1.45pt;mso-wrap-style:none;v-text-anchor:middle;mso-position-vertical:top">
-                <ns8:fill ns9:detectmouseclick="t" type="solid" color2="black"/>
-                <ns8:stroke color="black" joinstyle="round" endcap="flat"/>
-                <ns10:wrap type="square"/>
-              </ns8:rect>
+              <v:rect id="shape_0" fillcolor="white" stroked="t" o:allowincell="f" style="position:absolute;margin-left:0pt;margin-top:-1.55pt;width:453.55pt;height:1.45pt;mso-wrap-style:none;v-text-anchor:middle;mso-position-vertical:top">
+                <v:fill o:detectmouseclick="t" type="solid" color2="black"/>
+                <v:stroke color="black" joinstyle="round" endcap="flat"/>
+                <w10:wrap type="square"/>
+              </v:rect>
             </w:pict>
-          </ns1:Fallback>
-        </ns1:AlternateContent>
+          </mc:Fallback>
+        </mc:AlternateContent>
       </w:r>
       <w:bookmarkEnd w:id="13"/>
     </w:p>
@@ -11005,120 +11003,116 @@
       </w:pPr>
       <w:r>
         <w:rPr/>
-        <ns1:AlternateContent>
-          <ns1:Choice Requires="wps">
+        <mc:AlternateContent>
+          <mc:Choice Requires="wps">
             <w:drawing>
-              <ns3:inline distT="0" distB="0" distL="0" distR="0">
-                <ns3:extent cx="5760720" cy="19050"/>
-                <ns3:effectExtent l="0" t="0" r="0" b="0"/>
-                <ns3:docPr id="15" name="Shape15"/>
-                <ns4:graphic>
-                  <ns4:graphicData uri="http://schemas.microsoft.com/office/word/2010/wordprocessingShape">
-                    <ns6:wsp>
-                      <ns6:cNvSpPr/>
-                      <ns6:spPr>
-                        <ns4:xfrm>
-                          <ns4:off x="0" y="0"/>
-                          <ns4:ext cx="5760720" cy="19080"/>
-                        </ns4:xfrm>
-                        <ns4:prstGeom prst="rect">
-                          <ns4:avLst/>
-                        </ns4:prstGeom>
-                        <ns4:solidFill>
-                          <ns4:srgbClr val="FFFFFF"/>
-                        </ns4:solidFill>
-                        <ns4:ln w="0">
-                          <ns4:solidFill>
-                            <ns4:srgbClr val="000000"/>
-                          </ns4:solidFill>
-                        </ns4:ln>
-                      </ns6:spPr>
-                      <ns6:style>
-                        <ns4:lnRef idx="0"/>
-                        <ns4:fillRef idx="0"/>
-                        <ns4:effectRef idx="0"/>
-                        <ns4:fontRef idx="minor"/>
-                      </ns6:style>
-                      <ns6:bodyPr/>
-                    </ns6:wsp>
-                  </ns4:graphicData>
-                </ns4:graphic>
-                <ns7:sizeRelH relativeFrom="page">
-                  <ns7:pctWidth>100000</ns7:pctWidth>
-                </ns7:sizeRelH>
-              </ns3:inline>
+              <wp:inline distT="0" distB="0" distL="0" distR="0">
+                <wp:extent cx="5760720" cy="19050"/>
+                <wp:effectExtent l="0" t="0" r="0" b="0"/>
+                <wp:docPr id="15" name="Shape15"/>
+                <a:graphic xmlns:a="http://schemas.openxmlformats.org/drawingml/2006/main">
+                  <a:graphicData uri="http://schemas.microsoft.com/office/word/2010/wordprocessingShape">
+                    <wps:wsp>
+                      <wps:cNvSpPr/>
+                      <wps:spPr>
+                        <a:xfrm>
+                          <a:off x="0" y="0"/>
+                          <a:ext cx="5760720" cy="19080"/>
+                        </a:xfrm>
+                        <a:prstGeom prst="rect">
+                          <a:avLst/>
+                        </a:prstGeom>
+                        <a:solidFill>
+                          <a:srgbClr val="FFFFFF"/>
+                        </a:solidFill>
+                        <a:ln w="0">
+                          <a:solidFill>
+                            <a:srgbClr val="000000"/>
+                          </a:solidFill>
+                        </a:ln>
+                      </wps:spPr>
+                      <wps:style>
+                        <a:lnRef idx="0"/>
+                        <a:fillRef idx="0"/>
+                        <a:effectRef idx="0"/>
+                        <a:fontRef idx="minor"/>
+                      </wps:style>
+                      <wps:bodyPr/>
+                    </wps:wsp>
+                  </a:graphicData>
+                </a:graphic>
+                <wp14:sizeRelH relativeFrom="page">
+                  <wp14:pctWidth>100000</wp14:pctWidth>
+                </wp14:sizeRelH>
+              </wp:inline>
             </w:drawing>
-          </ns1:Choice>
-          <ns1:Fallback>
+          </mc:Choice>
+          <mc:Fallback>
             <w:pict>
-              <ns8:rect id="shape_0" fillcolor="white" stroked="t" ns9:allowincell="f" style="position:absolute;margin-left:0pt;margin-top:-1.55pt;width:453.55pt;height:1.45pt;mso-wrap-style:none;v-text-anchor:middle;mso-position-vertical:top">
-                <ns8:fill ns9:detectmouseclick="t" type="solid" color2="black"/>
-                <ns8:stroke color="black" joinstyle="round" endcap="flat"/>
-                <ns10:wrap type="square"/>
-              </ns8:rect>
+              <v:rect id="shape_0" fillcolor="white" stroked="t" o:allowincell="f" style="position:absolute;margin-left:0pt;margin-top:-1.55pt;width:453.55pt;height:1.45pt;mso-wrap-style:none;v-text-anchor:middle;mso-position-vertical:top">
+                <v:fill o:detectmouseclick="t" type="solid" color2="black"/>
+                <v:stroke color="black" joinstyle="round" endcap="flat"/>
+                <w10:wrap type="square"/>
+              </v:rect>
             </w:pict>
-          </ns1:Fallback>
-        </ns1:AlternateContent>
+          </mc:Fallback>
+        </mc:AlternateContent>
       </w:r>
     </w:p>
     <w:p>
       <w:pPr>
-        <w:pStyle w:val="InstatsColophon"/>
-        <w:keepNext w:val="true"/>
-        <w:keepLines/>
-        <w:rPr/>
-      </w:pPr>
-      <w:hyperlink r:id="rId3">
+        <w:pStyle w:val="FirstParagraph"/>
+        <w:rPr/>
+      </w:pPr>
+      <w:hyperlink r:id="rId4">
         <w:r>
           <w:rPr>
             <w:rStyle w:val="Hyperlink"/>
           </w:rPr>
           <w:drawing>
-            <ns3:inline distT="0" distB="0" distL="0" distR="0">
-              <ns3:extent cx="914400" cy="235585"/>
-              <ns3:effectExtent l="0" t="0" r="0" b="0"/>
-              <ns3:docPr id="16" name="Picture" descr="Instats"/>
-              <ns3:cNvGraphicFramePr>
-                <ns4:graphicFrameLocks noChangeAspect="1"/>
-              </ns3:cNvGraphicFramePr>
-              <ns4:graphic>
-                <ns4:graphicData uri="http://schemas.openxmlformats.org/drawingml/2006/picture">
-                  <ns5:pic>
-                    <ns5:nvPicPr>
-                      <ns5:cNvPr id="16" name="Picture" descr="Instats"/>
-                      <ns5:cNvPicPr>
-                        <ns4:picLocks noChangeAspect="1" noChangeArrowheads="1"/>
-                      </ns5:cNvPicPr>
-                    </ns5:nvPicPr>
-                    <ns5:blipFill>
-                      <ns4:blip r:embed="rId4"/>
-                      <ns4:stretch>
-                        <ns4:fillRect/>
-                      </ns4:stretch>
-                    </ns5:blipFill>
-                    <ns5:spPr bwMode="auto">
-                      <ns4:xfrm>
-                        <ns4:off x="0" y="0"/>
-                        <ns4:ext cx="914400" cy="235585"/>
-                      </ns4:xfrm>
-                      <ns4:prstGeom prst="rect">
-                        <ns4:avLst/>
-                      </ns4:prstGeom>
-                      <ns4:noFill/>
-                    </ns5:spPr>
-                  </ns5:pic>
-                </ns4:graphicData>
-              </ns4:graphic>
-            </ns3:inline>
+            <wp:inline distT="0" distB="0" distL="0" distR="0">
+              <wp:extent cx="914400" cy="235585"/>
+              <wp:effectExtent l="0" t="0" r="0" b="0"/>
+              <wp:docPr id="16" name="Picture" descr="Instats"/>
+              <wp:cNvGraphicFramePr>
+                <a:graphicFrameLocks xmlns:a="http://schemas.openxmlformats.org/drawingml/2006/main" noChangeAspect="1"/>
+              </wp:cNvGraphicFramePr>
+              <a:graphic xmlns:a="http://schemas.openxmlformats.org/drawingml/2006/main">
+                <a:graphicData uri="http://schemas.openxmlformats.org/drawingml/2006/picture">
+                  <pic:pic xmlns:pic="http://schemas.openxmlformats.org/drawingml/2006/picture">
+                    <pic:nvPicPr>
+                      <pic:cNvPr id="16" name="Picture" descr="Instats"/>
+                      <pic:cNvPicPr>
+                        <a:picLocks noChangeAspect="1" noChangeArrowheads="1"/>
+                      </pic:cNvPicPr>
+                    </pic:nvPicPr>
+                    <pic:blipFill>
+                      <a:blip r:embed="rId5"/>
+                      <a:stretch>
+                        <a:fillRect/>
+                      </a:stretch>
+                    </pic:blipFill>
+                    <pic:spPr bwMode="auto">
+                      <a:xfrm>
+                        <a:off x="0" y="0"/>
+                        <a:ext cx="914400" cy="235585"/>
+                      </a:xfrm>
+                      <a:prstGeom prst="rect">
+                        <a:avLst/>
+                      </a:prstGeom>
+                      <a:noFill/>
+                    </pic:spPr>
+                  </pic:pic>
+                </a:graphicData>
+              </a:graphic>
+            </wp:inline>
           </w:drawing>
         </w:r>
       </w:hyperlink>
     </w:p>
     <w:p>
       <w:pPr>
-        <w:pStyle w:val="InstatsColophon"/>
-        <w:keepNext w:val="true"/>
-        <w:keepLines/>
+        <w:pStyle w:val="BodyText"/>
         <w:rPr/>
       </w:pPr>
       <w:r>
@@ -11132,7 +11126,7 @@
         <w:rPr/>
         <w:t xml:space="preserve"> · Professor and Director, Instats · </w:t>
       </w:r>
-      <w:hyperlink r:id="rId5">
+      <w:hyperlink r:id="rId6">
         <w:r>
           <w:rPr>
             <w:rStyle w:val="Hyperlink"/>
@@ -11144,7 +11138,7 @@
         <w:rPr/>
         <w:t xml:space="preserve"> · </w:t>
       </w:r>
-      <w:hyperlink r:id="rId6">
+      <w:hyperlink r:id="rId7">
         <w:r>
           <w:rPr>
             <w:rStyle w:val="Hyperlink"/>
@@ -11156,49 +11150,96 @@
     <w:p>
       <w:pPr>
         <w:pStyle w:val="InstatsColophon"/>
+        <w:keepNext w:val="true"/>
         <w:keepLines/>
-        <w:pBdr>
-          <w:left w:val="single" w:sz="24" w:space="10" w:color="3092B1"/>
-        </w:pBdr>
-        <w:spacing w:lineRule="auto" w:line="336" w:before="80" w:after="160"/>
-        <w:ind w:start="283"/>
         <w:rPr/>
       </w:pPr>
       <w:r>
         <w:rPr>
           <w:b/>
-          <w:i w:val="0"/>
-        </w:rPr>
-        <w:t xml:space="preserve">Cite the pack. </w:t>
-      </w:r>
-      <w:r>
-        <w:rPr>
-          <w:i w:val="0"/>
-        </w:rPr>
-        <w:t xml:space="preserve">Zyphur, M. J. (2026). </w:t>
-      </w:r>
-      <w:hyperlink r:id="rId20">
+          <w:bCs/>
+        </w:rPr>
+        <w:t>Cite the pack.</w:t>
+      </w:r>
+      <w:r>
+        <w:rPr/>
+        <w:t xml:space="preserve"> Zyphur, M. J. (2026). </w:t>
+      </w:r>
+      <w:hyperlink r:id="rId8">
         <w:r>
           <w:rPr>
             <w:rStyle w:val="Hyperlink"/>
-            <w:i w:val="1"/>
+            <w:i/>
+            <w:iCs/>
           </w:rPr>
-          <w:t xml:space="preserve">The Institutional AI Readiness Pack: Self-Assessment and Implementation Tools for Responsible AI in Academic Research</w:t>
+          <w:t>The Institutional AI Readiness Pack: Self-Assessment and Implementation Tools for Responsible AI in Academic Research</w:t>
         </w:r>
       </w:hyperlink>
       <w:r>
         <w:rPr>
-          <w:i w:val="0"/>
-        </w:rPr>
-        <w:t xml:space="preserve">. Instats Policy Series. </w:t>
-      </w:r>
-      <w:hyperlink r:id="rId21">
+          <w:i/>
+          <w:iCs/>
+        </w:rPr>
+        <w:t>.</w:t>
+      </w:r>
+      <w:r>
+        <w:rPr/>
+        <w:t xml:space="preserve"> Instats Policy Series. </w:t>
+      </w:r>
+      <w:hyperlink r:id="rId9">
         <w:r>
           <w:rPr>
             <w:rStyle w:val="Hyperlink"/>
-            <w:i w:val="0"/>
           </w:rPr>
-          <w:t xml:space="preserve">https://doi.org/10.61700/bv2nulyhht</w:t>
+          <w:t>https://doi.org/10.61700/bv2nulyhht</w:t>
+        </w:r>
+      </w:hyperlink>
+    </w:p>
+    <w:p>
+      <w:pPr>
+        <w:pStyle w:val="InstatsColophon"/>
+        <w:keepNext w:val="true"/>
+        <w:keepLines/>
+        <w:rPr/>
+      </w:pPr>
+      <w:r>
+        <w:rPr>
+          <w:b/>
+          <w:bCs/>
+        </w:rPr>
+        <w:t>Companion report.</w:t>
+      </w:r>
+      <w:r>
+        <w:rPr/>
+        <w:t xml:space="preserve"> Zyphur, M. J. (2026). </w:t>
+      </w:r>
+      <w:hyperlink r:id="rId10">
+        <w:r>
+          <w:rPr>
+            <w:rStyle w:val="Hyperlink"/>
+            <w:i/>
+            <w:iCs/>
+          </w:rPr>
+          <w:t>Responsible AI in Academic Research: A Competency Framework for Research Training</w:t>
+        </w:r>
+      </w:hyperlink>
+      <w:r>
+        <w:rPr>
+          <w:i/>
+          <w:iCs/>
+        </w:rPr>
+        <w:t>.</w:t>
+      </w:r>
+      <w:r>
+        <w:rPr/>
+        <w:t xml:space="preserve"> Instats Policy Series. </w:t>
+      </w:r>
+      <w:hyperlink r:id="rId11">
+        <w:r>
+          <w:rPr>
+            <w:rStyle w:val="Hyperlink"/>
+          </w:rPr>
+          <w:t>https://doi.org/10.61700/t31oy23grr</w:t>
         </w:r>
       </w:hyperlink>
     </w:p>
@@ -11216,90 +11257,36 @@
       <w:r>
         <w:rPr>
           <w:b/>
-          <w:i w:val="0"/>
-        </w:rPr>
-        <w:t xml:space="preserve">Companion report. </w:t>
-      </w:r>
-      <w:r>
-        <w:rPr>
-          <w:i w:val="0"/>
-        </w:rPr>
-        <w:t xml:space="preserve">Zyphur, M. J. (2026). </w:t>
-      </w:r>
-      <w:hyperlink r:id="rId22">
+          <w:bCs/>
+        </w:rPr>
+        <w:t>License.</w:t>
+      </w:r>
+      <w:r>
+        <w:rPr/>
+        <w:t xml:space="preserve"> The pack and its instruments are licensed under </w:t>
+      </w:r>
+      <w:hyperlink r:id="rId12">
         <w:r>
           <w:rPr>
             <w:rStyle w:val="Hyperlink"/>
-            <w:i w:val="1"/>
           </w:rPr>
-          <w:t xml:space="preserve">Responsible AI in Academic Research: A Competency Framework for Research Training</w:t>
+          <w:t>Creative Commons Attribution 4.0 International (CC BY 4.0)</w:t>
         </w:r>
       </w:hyperlink>
       <w:r>
-        <w:rPr>
-          <w:i w:val="0"/>
-        </w:rPr>
-        <w:t xml:space="preserve">. Instats Policy Series. </w:t>
-      </w:r>
-      <w:hyperlink r:id="rId23">
-        <w:r>
-          <w:rPr>
-            <w:rStyle w:val="Hyperlink"/>
-            <w:i w:val="0"/>
-          </w:rPr>
-          <w:t xml:space="preserve">https://doi.org/10.61700/t31oy23grr</w:t>
-        </w:r>
-      </w:hyperlink>
-    </w:p>
-    <w:p>
-      <w:pPr>
-        <w:pStyle w:val="InstatsColophon"/>
-        <w:keepLines/>
-        <w:pBdr>
-          <w:left w:val="single" w:sz="24" w:space="10" w:color="3092B1"/>
-        </w:pBdr>
-        <w:spacing w:lineRule="auto" w:line="336" w:before="80" w:after="160"/>
-        <w:ind w:start="283"/>
-        <w:rPr/>
-      </w:pPr>
-      <w:r>
-        <w:rPr>
-          <w:b/>
-          <w:i w:val="0"/>
-        </w:rPr>
-        <w:t xml:space="preserve">License. </w:t>
-      </w:r>
-      <w:r>
-        <w:rPr>
-          <w:i w:val="0"/>
-        </w:rPr>
-        <w:t xml:space="preserve">The pack and its instruments are licensed under </w:t>
-      </w:r>
-      <w:hyperlink r:id="rId24">
-        <w:r>
-          <w:rPr>
-            <w:rStyle w:val="Hyperlink"/>
-            <w:i w:val="0"/>
-          </w:rPr>
-          <w:t xml:space="preserve">Creative Commons Attribution 4.0 International (CC BY 4.0)</w:t>
-        </w:r>
-      </w:hyperlink>
-      <w:r>
-        <w:rPr>
-          <w:i w:val="0"/>
-        </w:rPr>
-        <w:t xml:space="preserve">. You may adapt them for institutional use with attribution.</w:t>
+        <w:rPr/>
+        <w:t>. You may adapt them for institutional use with attribution.</w:t>
       </w:r>
       <w:bookmarkEnd w:id="0"/>
       <w:bookmarkEnd w:id="14"/>
     </w:p>
     <w:sectPr>
-      <w:headerReference w:type="even" r:id="rId8"/>
-      <w:headerReference w:type="default" r:id="rId9"/>
-      <w:headerReference w:type="first" r:id="rId10"/>
-      <w:footerReference w:type="even" r:id="rId11"/>
-      <w:footerReference w:type="default" r:id="rId12"/>
-      <w:footerReference w:type="first" r:id="rId13"/>
+      <w:headerReference w:type="even" r:id="rId13"/>
+      <w:headerReference w:type="default" r:id="rId14"/>
+      <w:headerReference w:type="first" r:id="rId15"/>
+      <w:footerReference w:type="even" r:id="rId16"/>
+      <w:footerReference w:type="default" r:id="rId17"/>
+      <w:footerReference w:type="first" r:id="rId18"/>
       <w:type w:val="nextPage"/>
       <w:pgSz w:w="11906" w:h="16838"/>
       <w:pgMar w:left="1417" w:right="1417" w:gutter="0" w:header="720" w:top="1361" w:footer="720" w:bottom="1361"/>
@@ -11336,38 +11323,23 @@
       <w:rPr/>
     </w:pPr>
     <w:r>
-      <w:rPr>
-        <w:i/>
-        <w:iCs/>
-      </w:rPr>
+      <w:rPr/>
       <w:fldChar w:fldCharType="begin"/>
     </w:r>
     <w:r>
-      <w:rPr>
-        <w:i/>
-        <w:iCs/>
-      </w:rPr>
+      <w:rPr/>
       <w:instrText xml:space="preserve"> PAGE </w:instrText>
     </w:r>
     <w:r>
-      <w:rPr>
-        <w:i/>
-        <w:iCs/>
-      </w:rPr>
+      <w:rPr/>
       <w:fldChar w:fldCharType="separate"/>
     </w:r>
     <w:r>
-      <w:rPr>
-        <w:i/>
-        <w:iCs/>
-      </w:rPr>
-      <w:t>21</w:t>
+      <w:rPr/>
+      <w:t>23</w:t>
     </w:r>
     <w:r>
-      <w:rPr>
-        <w:i/>
-        <w:iCs/>
-      </w:rPr>
+      <w:rPr/>
       <w:fldChar w:fldCharType="end"/>
     </w:r>
   </w:p>

</xml_diff>